<commit_message>
Deploy site 2026-03-12 09:00:41
</commit_message>
<xml_diff>
--- a/cv.docx
+++ b/cv.docx
@@ -1252,7 +1252,7 @@
           <w:rFonts w:ascii="Arial" w:hAnsi="Arial" w:cs="Arial"/>
           <w:szCs w:val="24"/>
         </w:rPr>
-        <w:t xml:space="preserve">Ollama, llama.cpp, </w:t>
+        <w:t xml:space="preserve">Ollama, </w:t>
       </w:r>
       <w:proofErr w:type="spellStart"/>
       <w:r>
@@ -1260,7 +1260,7 @@
           <w:rFonts w:ascii="Arial" w:hAnsi="Arial" w:cs="Arial"/>
           <w:szCs w:val="24"/>
         </w:rPr>
-        <w:t>llm</w:t>
+        <w:t>OpenClaw</w:t>
       </w:r>
       <w:proofErr w:type="spellEnd"/>
       <w:r>
@@ -1269,6 +1269,13 @@
           <w:szCs w:val="24"/>
         </w:rPr>
         <w:t xml:space="preserve">, </w:t>
+      </w:r>
+      <w:r>
+        <w:rPr>
+          <w:rFonts w:ascii="Arial" w:hAnsi="Arial" w:cs="Arial"/>
+          <w:szCs w:val="24"/>
+        </w:rPr>
+        <w:t xml:space="preserve">llama.cpp, </w:t>
       </w:r>
       <w:r>
         <w:rPr>

</xml_diff>

<commit_message>
Deploy site 2026-03-26 19:18:22
</commit_message>
<xml_diff>
--- a/cv.docx
+++ b/cv.docx
@@ -71,7 +71,15 @@
           <w:b/>
           <w:szCs w:val="24"/>
         </w:rPr>
-        <w:t>Personal information</w:t>
+        <w:t>Contact</w:t>
+      </w:r>
+      <w:r>
+        <w:rPr>
+          <w:rFonts w:ascii="Arial" w:hAnsi="Arial" w:cs="Arial"/>
+          <w:b/>
+          <w:szCs w:val="24"/>
+        </w:rPr>
+        <w:t xml:space="preserve"> information</w:t>
       </w:r>
     </w:p>
     <w:p>
@@ -100,96 +108,6 @@
         </w:rPr>
       </w:pPr>
       <w:bookmarkStart w:id="0" w:name="_MailAutoSig"/>
-      <w:r>
-        <w:rPr>
-          <w:rFonts w:ascii="Arial" w:hAnsi="Arial" w:cs="Arial"/>
-          <w:szCs w:val="24"/>
-          <w:lang w:val="en-GB"/>
-        </w:rPr>
-        <w:t>Department of Public Health and Primary Care, Cardiovascular Epidemiology Unit</w:t>
-      </w:r>
-    </w:p>
-    <w:p>
-      <w:pPr>
-        <w:jc w:val="both"/>
-        <w:rPr>
-          <w:rFonts w:ascii="Arial" w:hAnsi="Arial" w:cs="Arial"/>
-          <w:szCs w:val="24"/>
-          <w:lang w:val="en-GB"/>
-        </w:rPr>
-      </w:pPr>
-      <w:r>
-        <w:rPr>
-          <w:rFonts w:ascii="Arial" w:hAnsi="Arial" w:cs="Arial"/>
-          <w:szCs w:val="24"/>
-          <w:lang w:val="en-GB"/>
-        </w:rPr>
-        <w:t>University of Cambridge</w:t>
-      </w:r>
-    </w:p>
-    <w:p>
-      <w:pPr>
-        <w:jc w:val="both"/>
-        <w:rPr>
-          <w:rFonts w:ascii="Arial" w:hAnsi="Arial" w:cs="Arial"/>
-          <w:szCs w:val="24"/>
-          <w:lang w:val="en-GB"/>
-        </w:rPr>
-      </w:pPr>
-      <w:r>
-        <w:rPr>
-          <w:rFonts w:ascii="Arial" w:hAnsi="Arial" w:cs="Arial"/>
-          <w:szCs w:val="24"/>
-          <w:lang w:val="en-GB"/>
-        </w:rPr>
-        <w:t>Victor Phillip Dahdaleh Heart &amp; Lung Research Institute</w:t>
-      </w:r>
-    </w:p>
-    <w:p>
-      <w:pPr>
-        <w:jc w:val="both"/>
-        <w:rPr>
-          <w:rFonts w:ascii="Arial" w:hAnsi="Arial" w:cs="Arial"/>
-          <w:szCs w:val="24"/>
-          <w:lang w:val="en-GB"/>
-        </w:rPr>
-      </w:pPr>
-      <w:r>
-        <w:rPr>
-          <w:rFonts w:ascii="Arial" w:hAnsi="Arial" w:cs="Arial"/>
-          <w:szCs w:val="24"/>
-          <w:lang w:val="en-GB"/>
-        </w:rPr>
-        <w:t>Papworth Road, Cambridge Biomedical Campus</w:t>
-      </w:r>
-    </w:p>
-    <w:p>
-      <w:pPr>
-        <w:jc w:val="both"/>
-        <w:rPr>
-          <w:rFonts w:ascii="Arial" w:hAnsi="Arial" w:cs="Arial"/>
-          <w:szCs w:val="24"/>
-          <w:lang w:val="en-GB"/>
-        </w:rPr>
-      </w:pPr>
-      <w:r>
-        <w:rPr>
-          <w:rFonts w:ascii="Arial" w:hAnsi="Arial" w:cs="Arial"/>
-          <w:szCs w:val="24"/>
-          <w:lang w:val="en-GB"/>
-        </w:rPr>
-        <w:t>Cambridge CB2 0BB</w:t>
-      </w:r>
-    </w:p>
-    <w:p>
-      <w:pPr>
-        <w:jc w:val="both"/>
-        <w:rPr>
-          <w:rFonts w:ascii="Arial" w:hAnsi="Arial" w:cs="Arial"/>
-          <w:szCs w:val="24"/>
-          <w:lang w:val="en-GB"/>
-        </w:rPr>
-      </w:pPr>
       <w:r>
         <w:rPr>
           <w:rFonts w:ascii="Arial" w:hAnsi="Arial" w:cs="Arial"/>
@@ -553,7 +471,7 @@
           <w:b/>
           <w:szCs w:val="24"/>
         </w:rPr>
-        <w:t>Research interests</w:t>
+        <w:t>Research</w:t>
       </w:r>
     </w:p>
     <w:p>
@@ -2040,15 +1958,7 @@
           <w:rStyle w:val="markedcontent"/>
           <w:rFonts w:ascii="Arial" w:hAnsi="Arial" w:cs="Arial"/>
         </w:rPr>
-        <w:t xml:space="preserve">Pathak, G.A. et al. A first update on mapping the human genetic architecture of </w:t>
-      </w:r>
-      <w:r>
-        <w:rPr>
-          <w:rStyle w:val="markedcontent"/>
-          <w:rFonts w:ascii="Arial" w:hAnsi="Arial" w:cs="Arial"/>
-        </w:rPr>
-        <w:lastRenderedPageBreak/>
-        <w:t xml:space="preserve">COVID-19. </w:t>
+        <w:t xml:space="preserve">Pathak, G.A. et al. A first update on mapping the human genetic architecture of COVID-19. </w:t>
       </w:r>
       <w:r>
         <w:rPr>
@@ -2331,6 +2241,7 @@
           <w:szCs w:val="24"/>
           <w:lang w:val="fr-FR"/>
         </w:rPr>
+        <w:lastRenderedPageBreak/>
         <w:t>Zhao JH</w:t>
       </w:r>
       <w:r>
@@ -3497,7 +3408,6 @@
           <w:szCs w:val="24"/>
           <w:lang w:eastAsia="zh-CN"/>
         </w:rPr>
-        <w:lastRenderedPageBreak/>
         <w:t xml:space="preserve">Karasik D, et al. </w:t>
       </w:r>
       <w:r>
@@ -3645,6 +3555,7 @@
           <w:szCs w:val="24"/>
           <w:lang w:eastAsia="zh-CN"/>
         </w:rPr>
+        <w:lastRenderedPageBreak/>
         <w:t xml:space="preserve">Justice AE, et al. Protein-coding variants highlight the importance of lipolysis in adipocytes for body fat distribution. </w:t>
       </w:r>
       <w:r>
@@ -4796,7 +4707,6 @@
           <w:rFonts w:ascii="Arial" w:hAnsi="Arial" w:cs="Arial"/>
           <w:szCs w:val="24"/>
         </w:rPr>
-        <w:lastRenderedPageBreak/>
         <w:t xml:space="preserve">Wang Z, et al. </w:t>
       </w:r>
       <w:r>
@@ -4979,6 +4889,7 @@
           <w:szCs w:val="24"/>
           <w:lang w:val="en-GB" w:eastAsia="zh-CN"/>
         </w:rPr>
+        <w:lastRenderedPageBreak/>
         <w:t xml:space="preserve">Kanoni, S., et al. Implicating genes, pleiotropy, and sexual dimorphism at blood lipid loci through multi-ancestry meta-analysis. </w:t>
       </w:r>
       <w:r>

</xml_diff>

<commit_message>
Deploy site 2026-04-22 12:22:06
</commit_message>
<xml_diff>
--- a/cv.docx
+++ b/cv.docx
@@ -791,7 +791,7 @@
           <w:rFonts w:ascii="Arial" w:hAnsi="Arial" w:cs="Arial"/>
           <w:szCs w:val="24"/>
         </w:rPr>
-        <w:t>through</w:t>
+        <w:t>via</w:t>
       </w:r>
       <w:r>
         <w:rPr>
@@ -1010,6 +1010,27 @@
           <w:rFonts w:ascii="Arial" w:hAnsi="Arial" w:cs="Arial"/>
           <w:szCs w:val="24"/>
         </w:rPr>
+        <w:t xml:space="preserve">and experiment </w:t>
+      </w:r>
+      <w:r>
+        <w:rPr>
+          <w:rFonts w:ascii="Arial" w:hAnsi="Arial" w:cs="Arial"/>
+          <w:szCs w:val="24"/>
+        </w:rPr>
+        <w:t xml:space="preserve">with </w:t>
+      </w:r>
+      <w:r>
+        <w:rPr>
+          <w:rFonts w:ascii="Arial" w:hAnsi="Arial" w:cs="Arial"/>
+          <w:szCs w:val="24"/>
+        </w:rPr>
+        <w:t xml:space="preserve">them </w:t>
+      </w:r>
+      <w:r>
+        <w:rPr>
+          <w:rFonts w:ascii="Arial" w:hAnsi="Arial" w:cs="Arial"/>
+          <w:szCs w:val="24"/>
+        </w:rPr>
         <w:t xml:space="preserve">on </w:t>
       </w:r>
       <w:r>
@@ -1130,6 +1151,13 @@
         </w:rPr>
         <w:t xml:space="preserve">, </w:t>
       </w:r>
+      <w:r>
+        <w:rPr>
+          <w:rFonts w:ascii="Arial" w:hAnsi="Arial" w:cs="Arial"/>
+          <w:szCs w:val="24"/>
+        </w:rPr>
+        <w:t xml:space="preserve">codex-cli, copilot-cli, </w:t>
+      </w:r>
       <w:proofErr w:type="spellStart"/>
       <w:r>
         <w:rPr>
@@ -1146,6 +1174,22 @@
         </w:rPr>
         <w:t xml:space="preserve">-cli, </w:t>
       </w:r>
+      <w:proofErr w:type="spellStart"/>
+      <w:r>
+        <w:rPr>
+          <w:rFonts w:ascii="Arial" w:hAnsi="Arial" w:cs="Arial"/>
+          <w:szCs w:val="24"/>
+        </w:rPr>
+        <w:t>hermes</w:t>
+      </w:r>
+      <w:proofErr w:type="spellEnd"/>
+      <w:r>
+        <w:rPr>
+          <w:rFonts w:ascii="Arial" w:hAnsi="Arial" w:cs="Arial"/>
+          <w:szCs w:val="24"/>
+        </w:rPr>
+        <w:t xml:space="preserve">-agent, </w:t>
+      </w:r>
       <w:r>
         <w:rPr>
           <w:rFonts w:ascii="Arial" w:hAnsi="Arial" w:cs="Arial"/>
@@ -1157,6 +1201,60 @@
         <w:rPr>
           <w:rFonts w:ascii="Arial" w:hAnsi="Arial" w:cs="Arial"/>
         </w:rPr>
+        <w:t xml:space="preserve">They also involve models, platforms and libraries such as TensorFlow, </w:t>
+      </w:r>
+      <w:proofErr w:type="spellStart"/>
+      <w:r>
+        <w:rPr>
+          <w:rFonts w:ascii="Arial" w:hAnsi="Arial" w:cs="Arial"/>
+        </w:rPr>
+        <w:t>PyTorch</w:t>
+      </w:r>
+      <w:proofErr w:type="spellEnd"/>
+      <w:r>
+        <w:rPr>
+          <w:rFonts w:ascii="Arial" w:hAnsi="Arial" w:cs="Arial"/>
+        </w:rPr>
+        <w:t>, scikit-</w:t>
+      </w:r>
+      <w:proofErr w:type="spellStart"/>
+      <w:r>
+        <w:rPr>
+          <w:rFonts w:ascii="Arial" w:hAnsi="Arial" w:cs="Arial"/>
+        </w:rPr>
+        <w:t>llm</w:t>
+      </w:r>
+      <w:proofErr w:type="spellEnd"/>
+      <w:r>
+        <w:rPr>
+          <w:rFonts w:ascii="Arial" w:hAnsi="Arial" w:cs="Arial"/>
+        </w:rPr>
+        <w:t xml:space="preserve">, </w:t>
+      </w:r>
+      <w:proofErr w:type="spellStart"/>
+      <w:r>
+        <w:rPr>
+          <w:rFonts w:ascii="Arial" w:hAnsi="Arial" w:cs="Arial"/>
+        </w:rPr>
+        <w:t>LangChain</w:t>
+      </w:r>
+      <w:proofErr w:type="spellEnd"/>
+      <w:r>
+        <w:rPr>
+          <w:rFonts w:ascii="Arial" w:hAnsi="Arial" w:cs="Arial"/>
+        </w:rPr>
+        <w:t>.</w:t>
+      </w:r>
+      <w:r>
+        <w:rPr>
+          <w:rFonts w:ascii="Arial" w:hAnsi="Arial" w:cs="Arial"/>
+        </w:rPr>
+        <w:t xml:space="preserve"> </w:t>
+      </w:r>
+      <w:r>
+        <w:rPr>
+          <w:rFonts w:ascii="Arial" w:hAnsi="Arial" w:cs="Arial"/>
+        </w:rPr>
         <w:t>featur</w:t>
       </w:r>
       <w:r>
@@ -1169,6 +1267,12 @@
         <w:rPr>
           <w:rFonts w:ascii="Arial" w:hAnsi="Arial" w:cs="Arial"/>
         </w:rPr>
+        <w:t xml:space="preserve">popular publications and </w:t>
+      </w:r>
+      <w:r>
+        <w:rPr>
+          <w:rFonts w:ascii="Arial" w:hAnsi="Arial" w:cs="Arial"/>
+        </w:rPr>
         <w:t xml:space="preserve">AI for MS data with </w:t>
       </w:r>
       <w:proofErr w:type="spellStart"/>
@@ -1183,25 +1287,147 @@
         <w:rPr>
           <w:rFonts w:ascii="Arial" w:hAnsi="Arial" w:cs="Arial"/>
         </w:rPr>
-        <w:t xml:space="preserve"> &amp; DIA-NN, m</w:t>
-      </w:r>
-      <w:r>
-        <w:rPr>
-          <w:rFonts w:ascii="Arial" w:hAnsi="Arial" w:cs="Arial"/>
-        </w:rPr>
-        <w:t xml:space="preserve">olecule </w:t>
-      </w:r>
-      <w:r>
-        <w:rPr>
-          <w:rFonts w:ascii="Arial" w:hAnsi="Arial" w:cs="Arial"/>
-        </w:rPr>
-        <w:t>o</w:t>
-      </w:r>
-      <w:r>
-        <w:rPr>
-          <w:rFonts w:ascii="Arial" w:hAnsi="Arial" w:cs="Arial"/>
-        </w:rPr>
-        <w:t xml:space="preserve">ptimization </w:t>
+        <w:t xml:space="preserve"> &amp; DIA-NN, single-cell omics with Seurat, </w:t>
+      </w:r>
+      <w:proofErr w:type="spellStart"/>
+      <w:r>
+        <w:rPr>
+          <w:rFonts w:ascii="Arial" w:hAnsi="Arial" w:cs="Arial"/>
+        </w:rPr>
+        <w:t>scp</w:t>
+      </w:r>
+      <w:proofErr w:type="spellEnd"/>
+      <w:r>
+        <w:rPr>
+          <w:rFonts w:ascii="Arial" w:hAnsi="Arial" w:cs="Arial"/>
+        </w:rPr>
+        <w:t xml:space="preserve">, </w:t>
+      </w:r>
+      <w:proofErr w:type="spellStart"/>
+      <w:r>
+        <w:rPr>
+          <w:rFonts w:ascii="Arial" w:hAnsi="Arial" w:cs="Arial"/>
+        </w:rPr>
+        <w:t>scanpy</w:t>
+      </w:r>
+      <w:proofErr w:type="spellEnd"/>
+      <w:r>
+        <w:rPr>
+          <w:rFonts w:ascii="Arial" w:hAnsi="Arial" w:cs="Arial"/>
+        </w:rPr>
+        <w:t xml:space="preserve">, </w:t>
+      </w:r>
+      <w:proofErr w:type="spellStart"/>
+      <w:r>
+        <w:rPr>
+          <w:rFonts w:ascii="Arial" w:hAnsi="Arial" w:cs="Arial"/>
+        </w:rPr>
+        <w:t>scvi</w:t>
+      </w:r>
+      <w:proofErr w:type="spellEnd"/>
+      <w:r>
+        <w:rPr>
+          <w:rFonts w:ascii="Arial" w:hAnsi="Arial" w:cs="Arial"/>
+        </w:rPr>
+        <w:t xml:space="preserve">-tools, </w:t>
+      </w:r>
+      <w:proofErr w:type="spellStart"/>
+      <w:r>
+        <w:rPr>
+          <w:rFonts w:ascii="Arial" w:hAnsi="Arial" w:cs="Arial"/>
+        </w:rPr>
+        <w:t>scGPT</w:t>
+      </w:r>
+      <w:proofErr w:type="spellEnd"/>
+      <w:r>
+        <w:rPr>
+          <w:rFonts w:ascii="Arial" w:hAnsi="Arial" w:cs="Arial"/>
+        </w:rPr>
+        <w:t>,</w:t>
+      </w:r>
+      <w:r>
+        <w:rPr>
+          <w:rFonts w:ascii="Arial" w:hAnsi="Arial" w:cs="Arial"/>
+        </w:rPr>
+        <w:t xml:space="preserve"> C2S-Scale</w:t>
+      </w:r>
+      <w:r>
+        <w:rPr>
+          <w:rFonts w:ascii="Arial" w:hAnsi="Arial" w:cs="Arial"/>
+        </w:rPr>
+        <w:t xml:space="preserve">, </w:t>
+      </w:r>
+      <w:r>
+        <w:rPr>
+          <w:rFonts w:ascii="Arial" w:hAnsi="Arial" w:cs="Arial"/>
+        </w:rPr>
+        <w:t xml:space="preserve">mtDNA analysis with </w:t>
+      </w:r>
+      <w:proofErr w:type="spellStart"/>
+      <w:r>
+        <w:rPr>
+          <w:rFonts w:ascii="Arial" w:hAnsi="Arial" w:cs="Arial"/>
+        </w:rPr>
+        <w:t>MToolBox</w:t>
+      </w:r>
+      <w:proofErr w:type="spellEnd"/>
+      <w:r>
+        <w:rPr>
+          <w:rFonts w:ascii="Arial" w:hAnsi="Arial" w:cs="Arial"/>
+        </w:rPr>
+        <w:t xml:space="preserve">, </w:t>
+      </w:r>
+      <w:proofErr w:type="spellStart"/>
+      <w:r>
+        <w:rPr>
+          <w:rFonts w:ascii="Arial" w:hAnsi="Arial" w:cs="Arial"/>
+        </w:rPr>
+        <w:t>fNUMT</w:t>
+      </w:r>
+      <w:proofErr w:type="spellEnd"/>
+      <w:r>
+        <w:rPr>
+          <w:rFonts w:ascii="Arial" w:hAnsi="Arial" w:cs="Arial"/>
+        </w:rPr>
+        <w:t xml:space="preserve">, </w:t>
+      </w:r>
+      <w:proofErr w:type="spellStart"/>
+      <w:r>
+        <w:rPr>
+          <w:rFonts w:ascii="Arial" w:hAnsi="Arial" w:cs="Arial"/>
+        </w:rPr>
+        <w:t>haplogrep</w:t>
+      </w:r>
+      <w:proofErr w:type="spellEnd"/>
+      <w:r>
+        <w:rPr>
+          <w:rFonts w:ascii="Arial" w:hAnsi="Arial" w:cs="Arial"/>
+        </w:rPr>
+        <w:t xml:space="preserve"> </w:t>
+      </w:r>
+      <w:r>
+        <w:rPr>
+          <w:rFonts w:ascii="Arial" w:hAnsi="Arial" w:cs="Arial"/>
+        </w:rPr>
+        <w:t>a</w:t>
+      </w:r>
+      <w:r>
+        <w:rPr>
+          <w:rFonts w:ascii="Arial" w:hAnsi="Arial" w:cs="Arial"/>
+        </w:rPr>
+        <w:t xml:space="preserve">s well as </w:t>
+      </w:r>
+      <w:r>
+        <w:rPr>
+          <w:rFonts w:ascii="Arial" w:hAnsi="Arial" w:cs="Arial"/>
+        </w:rPr>
+        <w:t xml:space="preserve">long-read sequencing </w:t>
+      </w:r>
+      <w:r>
+        <w:rPr>
+          <w:rFonts w:ascii="Arial" w:hAnsi="Arial" w:cs="Arial"/>
+        </w:rPr>
+        <w:t xml:space="preserve">analysis </w:t>
       </w:r>
       <w:r>
         <w:rPr>
@@ -1214,27 +1440,83 @@
         <w:rPr>
           <w:rFonts w:ascii="Arial" w:hAnsi="Arial" w:cs="Arial"/>
         </w:rPr>
-        <w:t>DrugAssist</w:t>
+        <w:t>SVanalyzer</w:t>
       </w:r>
       <w:proofErr w:type="spellEnd"/>
       <w:r>
         <w:rPr>
           <w:rFonts w:ascii="Arial" w:hAnsi="Arial" w:cs="Arial"/>
         </w:rPr>
-        <w:t xml:space="preserve">, single-cell omics with Seurat, </w:t>
+        <w:t xml:space="preserve">, </w:t>
+      </w:r>
+      <w:r>
+        <w:rPr>
+          <w:rFonts w:ascii="Arial" w:hAnsi="Arial" w:cs="Arial"/>
+        </w:rPr>
+        <w:t>hap.py, sniffles,</w:t>
+      </w:r>
+      <w:r>
+        <w:rPr>
+          <w:rFonts w:ascii="Arial" w:hAnsi="Arial" w:cs="Arial"/>
+        </w:rPr>
+        <w:t xml:space="preserve"> </w:t>
       </w:r>
       <w:proofErr w:type="spellStart"/>
       <w:r>
         <w:rPr>
           <w:rFonts w:ascii="Arial" w:hAnsi="Arial" w:cs="Arial"/>
         </w:rPr>
-        <w:t>scp</w:t>
+        <w:t>truvari</w:t>
       </w:r>
       <w:proofErr w:type="spellEnd"/>
       <w:r>
         <w:rPr>
           <w:rFonts w:ascii="Arial" w:hAnsi="Arial" w:cs="Arial"/>
         </w:rPr>
+        <w:t>.</w:t>
+      </w:r>
+      <w:r>
+        <w:rPr>
+          <w:rFonts w:ascii="Arial" w:hAnsi="Arial" w:cs="Arial"/>
+        </w:rPr>
+        <w:t xml:space="preserve"> </w:t>
+      </w:r>
+      <w:r>
+        <w:rPr>
+          <w:rFonts w:ascii="Arial" w:hAnsi="Arial" w:cs="Arial"/>
+        </w:rPr>
+        <w:t>Exploration</w:t>
+      </w:r>
+      <w:r>
+        <w:rPr>
+          <w:rFonts w:ascii="Arial" w:hAnsi="Arial" w:cs="Arial"/>
+        </w:rPr>
+        <w:t>s</w:t>
+      </w:r>
+      <w:r>
+        <w:rPr>
+          <w:rFonts w:ascii="Arial" w:hAnsi="Arial" w:cs="Arial"/>
+        </w:rPr>
+        <w:t xml:space="preserve"> in p</w:t>
+      </w:r>
+      <w:r>
+        <w:rPr>
+          <w:rFonts w:ascii="Arial" w:hAnsi="Arial" w:cs="Arial"/>
+        </w:rPr>
+        <w:t xml:space="preserve">opulation genetics include </w:t>
+      </w:r>
+      <w:proofErr w:type="spellStart"/>
+      <w:r>
+        <w:rPr>
+          <w:rFonts w:ascii="Arial" w:hAnsi="Arial" w:cs="Arial"/>
+        </w:rPr>
+        <w:t>selscan</w:t>
+      </w:r>
+      <w:proofErr w:type="spellEnd"/>
+      <w:r>
+        <w:rPr>
+          <w:rFonts w:ascii="Arial" w:hAnsi="Arial" w:cs="Arial"/>
+        </w:rPr>
         <w:t xml:space="preserve">, </w:t>
       </w:r>
       <w:proofErr w:type="spellStart"/>
@@ -1242,380 +1524,14 @@
         <w:rPr>
           <w:rFonts w:ascii="Arial" w:hAnsi="Arial" w:cs="Arial"/>
         </w:rPr>
-        <w:t>scanpy</w:t>
+        <w:t>angsd</w:t>
       </w:r>
       <w:proofErr w:type="spellEnd"/>
       <w:r>
         <w:rPr>
           <w:rFonts w:ascii="Arial" w:hAnsi="Arial" w:cs="Arial"/>
         </w:rPr>
-        <w:t xml:space="preserve">, </w:t>
-      </w:r>
-      <w:proofErr w:type="spellStart"/>
-      <w:r>
-        <w:rPr>
-          <w:rFonts w:ascii="Arial" w:hAnsi="Arial" w:cs="Arial"/>
-        </w:rPr>
-        <w:t>scvi</w:t>
-      </w:r>
-      <w:proofErr w:type="spellEnd"/>
-      <w:r>
-        <w:rPr>
-          <w:rFonts w:ascii="Arial" w:hAnsi="Arial" w:cs="Arial"/>
-        </w:rPr>
-        <w:t xml:space="preserve">-tools, </w:t>
-      </w:r>
-      <w:proofErr w:type="spellStart"/>
-      <w:r>
-        <w:rPr>
-          <w:rFonts w:ascii="Arial" w:hAnsi="Arial" w:cs="Arial"/>
-        </w:rPr>
-        <w:t>scGPT</w:t>
-      </w:r>
-      <w:proofErr w:type="spellEnd"/>
-      <w:r>
-        <w:rPr>
-          <w:rFonts w:ascii="Arial" w:hAnsi="Arial" w:cs="Arial"/>
-        </w:rPr>
-        <w:t>,</w:t>
-      </w:r>
-      <w:r>
-        <w:rPr>
-          <w:rFonts w:ascii="Arial" w:hAnsi="Arial" w:cs="Arial"/>
-        </w:rPr>
-        <w:t xml:space="preserve"> C2S-Scale</w:t>
-      </w:r>
-      <w:r>
-        <w:rPr>
-          <w:rFonts w:ascii="Arial" w:hAnsi="Arial" w:cs="Arial"/>
-        </w:rPr>
-        <w:t xml:space="preserve">, </w:t>
-      </w:r>
-      <w:r>
-        <w:rPr>
-          <w:rFonts w:ascii="Arial" w:hAnsi="Arial" w:cs="Arial"/>
-        </w:rPr>
-        <w:t xml:space="preserve">mtDNA analysis with </w:t>
-      </w:r>
-      <w:proofErr w:type="spellStart"/>
-      <w:r>
-        <w:rPr>
-          <w:rFonts w:ascii="Arial" w:hAnsi="Arial" w:cs="Arial"/>
-        </w:rPr>
-        <w:t>MToolBox</w:t>
-      </w:r>
-      <w:proofErr w:type="spellEnd"/>
-      <w:r>
-        <w:rPr>
-          <w:rFonts w:ascii="Arial" w:hAnsi="Arial" w:cs="Arial"/>
-        </w:rPr>
-        <w:t xml:space="preserve">, </w:t>
-      </w:r>
-      <w:proofErr w:type="spellStart"/>
-      <w:r>
-        <w:rPr>
-          <w:rFonts w:ascii="Arial" w:hAnsi="Arial" w:cs="Arial"/>
-        </w:rPr>
-        <w:t>fNUMT</w:t>
-      </w:r>
-      <w:proofErr w:type="spellEnd"/>
-      <w:r>
-        <w:rPr>
-          <w:rFonts w:ascii="Arial" w:hAnsi="Arial" w:cs="Arial"/>
-        </w:rPr>
-        <w:t xml:space="preserve">, </w:t>
-      </w:r>
-      <w:proofErr w:type="spellStart"/>
-      <w:r>
-        <w:rPr>
-          <w:rFonts w:ascii="Arial" w:hAnsi="Arial" w:cs="Arial"/>
-        </w:rPr>
-        <w:t>haplogrep</w:t>
-      </w:r>
-      <w:proofErr w:type="spellEnd"/>
-      <w:r>
-        <w:rPr>
-          <w:rFonts w:ascii="Arial" w:hAnsi="Arial" w:cs="Arial"/>
-        </w:rPr>
-        <w:t xml:space="preserve"> </w:t>
-      </w:r>
-      <w:r>
-        <w:rPr>
-          <w:rFonts w:ascii="Arial" w:hAnsi="Arial" w:cs="Arial"/>
-        </w:rPr>
-        <w:t>a</w:t>
-      </w:r>
-      <w:r>
-        <w:rPr>
-          <w:rFonts w:ascii="Arial" w:hAnsi="Arial" w:cs="Arial"/>
-        </w:rPr>
-        <w:t xml:space="preserve">s well as </w:t>
-      </w:r>
-      <w:r>
-        <w:rPr>
-          <w:rFonts w:ascii="Arial" w:hAnsi="Arial" w:cs="Arial"/>
-        </w:rPr>
-        <w:t xml:space="preserve">long-read sequencing </w:t>
-      </w:r>
-      <w:r>
-        <w:rPr>
-          <w:rFonts w:ascii="Arial" w:hAnsi="Arial" w:cs="Arial"/>
-        </w:rPr>
-        <w:t xml:space="preserve">analysis </w:t>
-      </w:r>
-      <w:r>
-        <w:rPr>
-          <w:rFonts w:ascii="Arial" w:hAnsi="Arial" w:cs="Arial"/>
-        </w:rPr>
-        <w:t xml:space="preserve">with </w:t>
-      </w:r>
-      <w:proofErr w:type="spellStart"/>
-      <w:r>
-        <w:rPr>
-          <w:rFonts w:ascii="Arial" w:hAnsi="Arial" w:cs="Arial"/>
-        </w:rPr>
-        <w:t>SVanalyzer</w:t>
-      </w:r>
-      <w:proofErr w:type="spellEnd"/>
-      <w:r>
-        <w:rPr>
-          <w:rFonts w:ascii="Arial" w:hAnsi="Arial" w:cs="Arial"/>
-        </w:rPr>
-        <w:t xml:space="preserve">, </w:t>
-      </w:r>
-      <w:r>
-        <w:rPr>
-          <w:rFonts w:ascii="Arial" w:hAnsi="Arial" w:cs="Arial"/>
-        </w:rPr>
-        <w:t>hap.py, sniffles,</w:t>
-      </w:r>
-      <w:r>
-        <w:rPr>
-          <w:rFonts w:ascii="Arial" w:hAnsi="Arial" w:cs="Arial"/>
-        </w:rPr>
-        <w:t xml:space="preserve"> </w:t>
-      </w:r>
-      <w:proofErr w:type="spellStart"/>
-      <w:r>
-        <w:rPr>
-          <w:rFonts w:ascii="Arial" w:hAnsi="Arial" w:cs="Arial"/>
-        </w:rPr>
-        <w:t>truvari</w:t>
-      </w:r>
-      <w:proofErr w:type="spellEnd"/>
-      <w:r>
-        <w:rPr>
-          <w:rFonts w:ascii="Arial" w:hAnsi="Arial" w:cs="Arial"/>
-        </w:rPr>
-        <w:t>.</w:t>
-      </w:r>
-      <w:r>
-        <w:rPr>
-          <w:rFonts w:ascii="Arial" w:hAnsi="Arial" w:cs="Arial"/>
-        </w:rPr>
-        <w:t xml:space="preserve"> </w:t>
-      </w:r>
-      <w:r>
-        <w:rPr>
-          <w:rFonts w:ascii="Arial" w:hAnsi="Arial" w:cs="Arial"/>
-        </w:rPr>
-        <w:t>Exploration</w:t>
-      </w:r>
-      <w:r>
-        <w:rPr>
-          <w:rFonts w:ascii="Arial" w:hAnsi="Arial" w:cs="Arial"/>
-        </w:rPr>
-        <w:t>s</w:t>
-      </w:r>
-      <w:r>
-        <w:rPr>
-          <w:rFonts w:ascii="Arial" w:hAnsi="Arial" w:cs="Arial"/>
-        </w:rPr>
-        <w:t xml:space="preserve"> in p</w:t>
-      </w:r>
-      <w:r>
-        <w:rPr>
-          <w:rFonts w:ascii="Arial" w:hAnsi="Arial" w:cs="Arial"/>
-        </w:rPr>
-        <w:t xml:space="preserve">opulation genetics include </w:t>
-      </w:r>
-      <w:proofErr w:type="spellStart"/>
-      <w:r>
-        <w:rPr>
-          <w:rFonts w:ascii="Arial" w:hAnsi="Arial" w:cs="Arial"/>
-        </w:rPr>
-        <w:t>selscan</w:t>
-      </w:r>
-      <w:proofErr w:type="spellEnd"/>
-      <w:r>
-        <w:rPr>
-          <w:rFonts w:ascii="Arial" w:hAnsi="Arial" w:cs="Arial"/>
-        </w:rPr>
-        <w:t xml:space="preserve">, </w:t>
-      </w:r>
-      <w:proofErr w:type="spellStart"/>
-      <w:r>
-        <w:rPr>
-          <w:rFonts w:ascii="Arial" w:hAnsi="Arial" w:cs="Arial"/>
-        </w:rPr>
-        <w:t>angsd</w:t>
-      </w:r>
-      <w:proofErr w:type="spellEnd"/>
-      <w:r>
-        <w:rPr>
-          <w:rFonts w:ascii="Arial" w:hAnsi="Arial" w:cs="Arial"/>
-        </w:rPr>
         <w:t>, relate, clues2 and fastsimcoal2.</w:t>
-      </w:r>
-      <w:r>
-        <w:rPr>
-          <w:rFonts w:ascii="Arial" w:hAnsi="Arial" w:cs="Arial"/>
-        </w:rPr>
-        <w:t xml:space="preserve"> </w:t>
-      </w:r>
-      <w:r>
-        <w:rPr>
-          <w:rFonts w:ascii="Arial" w:hAnsi="Arial" w:cs="Arial"/>
-        </w:rPr>
-        <w:t>E</w:t>
-      </w:r>
-      <w:r>
-        <w:rPr>
-          <w:rFonts w:ascii="Arial" w:hAnsi="Arial" w:cs="Arial"/>
-        </w:rPr>
-        <w:t>xtensive</w:t>
-      </w:r>
-      <w:r>
-        <w:rPr>
-          <w:rFonts w:ascii="Arial" w:hAnsi="Arial" w:cs="Arial"/>
-        </w:rPr>
-        <w:t xml:space="preserve"> experiments</w:t>
-      </w:r>
-      <w:r>
-        <w:rPr>
-          <w:rFonts w:ascii="Arial" w:hAnsi="Arial" w:cs="Arial"/>
-        </w:rPr>
-        <w:t xml:space="preserve"> </w:t>
-      </w:r>
-      <w:r>
-        <w:rPr>
-          <w:rFonts w:ascii="Arial" w:hAnsi="Arial" w:cs="Arial"/>
-        </w:rPr>
-        <w:t xml:space="preserve">are conducted </w:t>
-      </w:r>
-      <w:r>
-        <w:rPr>
-          <w:rFonts w:ascii="Arial" w:hAnsi="Arial" w:cs="Arial"/>
-        </w:rPr>
-        <w:t>on</w:t>
-      </w:r>
-      <w:r>
-        <w:rPr>
-          <w:rFonts w:ascii="Arial" w:hAnsi="Arial" w:cs="Arial"/>
-        </w:rPr>
-        <w:t xml:space="preserve"> </w:t>
-      </w:r>
-      <w:r>
-        <w:rPr>
-          <w:rFonts w:ascii="Arial" w:hAnsi="Arial" w:cs="Arial"/>
-        </w:rPr>
-        <w:t xml:space="preserve">models, </w:t>
-      </w:r>
-      <w:r>
-        <w:rPr>
-          <w:rFonts w:ascii="Arial" w:hAnsi="Arial" w:cs="Arial"/>
-        </w:rPr>
-        <w:t xml:space="preserve">platforms </w:t>
-      </w:r>
-      <w:r>
-        <w:rPr>
-          <w:rFonts w:ascii="Arial" w:hAnsi="Arial" w:cs="Arial"/>
-        </w:rPr>
-        <w:t>and</w:t>
-      </w:r>
-      <w:r>
-        <w:rPr>
-          <w:rFonts w:ascii="Arial" w:hAnsi="Arial" w:cs="Arial"/>
-        </w:rPr>
-        <w:t xml:space="preserve"> libraries such as </w:t>
-      </w:r>
-      <w:r>
-        <w:rPr>
-          <w:rFonts w:ascii="Arial" w:hAnsi="Arial" w:cs="Arial"/>
-        </w:rPr>
-        <w:t>T</w:t>
-      </w:r>
-      <w:r>
-        <w:rPr>
-          <w:rFonts w:ascii="Arial" w:hAnsi="Arial" w:cs="Arial"/>
-        </w:rPr>
-        <w:t>ensor</w:t>
-      </w:r>
-      <w:r>
-        <w:rPr>
-          <w:rFonts w:ascii="Arial" w:hAnsi="Arial" w:cs="Arial"/>
-        </w:rPr>
-        <w:t>F</w:t>
-      </w:r>
-      <w:r>
-        <w:rPr>
-          <w:rFonts w:ascii="Arial" w:hAnsi="Arial" w:cs="Arial"/>
-        </w:rPr>
-        <w:t xml:space="preserve">low, </w:t>
-      </w:r>
-      <w:proofErr w:type="spellStart"/>
-      <w:r>
-        <w:rPr>
-          <w:rFonts w:ascii="Arial" w:hAnsi="Arial" w:cs="Arial"/>
-        </w:rPr>
-        <w:t>PyTorch</w:t>
-      </w:r>
-      <w:proofErr w:type="spellEnd"/>
-      <w:r>
-        <w:rPr>
-          <w:rFonts w:ascii="Arial" w:hAnsi="Arial" w:cs="Arial"/>
-        </w:rPr>
-        <w:t>,</w:t>
-      </w:r>
-      <w:r>
-        <w:rPr>
-          <w:rFonts w:ascii="Arial" w:hAnsi="Arial" w:cs="Arial"/>
-        </w:rPr>
-        <w:t xml:space="preserve"> </w:t>
-      </w:r>
-      <w:r>
-        <w:rPr>
-          <w:rFonts w:ascii="Arial" w:hAnsi="Arial" w:cs="Arial"/>
-        </w:rPr>
-        <w:t>scikit-</w:t>
-      </w:r>
-      <w:proofErr w:type="spellStart"/>
-      <w:r>
-        <w:rPr>
-          <w:rFonts w:ascii="Arial" w:hAnsi="Arial" w:cs="Arial"/>
-        </w:rPr>
-        <w:t>llm</w:t>
-      </w:r>
-      <w:proofErr w:type="spellEnd"/>
-      <w:r>
-        <w:rPr>
-          <w:rFonts w:ascii="Arial" w:hAnsi="Arial" w:cs="Arial"/>
-        </w:rPr>
-        <w:t xml:space="preserve">, </w:t>
-      </w:r>
-      <w:proofErr w:type="spellStart"/>
-      <w:r>
-        <w:rPr>
-          <w:rFonts w:ascii="Arial" w:hAnsi="Arial" w:cs="Arial"/>
-        </w:rPr>
-        <w:t>LangChain</w:t>
-      </w:r>
-      <w:proofErr w:type="spellEnd"/>
-      <w:r>
-        <w:rPr>
-          <w:rFonts w:ascii="Arial" w:hAnsi="Arial" w:cs="Arial"/>
-        </w:rPr>
-        <w:t>.</w:t>
       </w:r>
     </w:p>
     <w:p>

</xml_diff>

<commit_message>
Deploy site 2026-05-22 08:23:50
</commit_message>
<xml_diff>
--- a/cv.docx
+++ b/cv.docx
@@ -1243,13 +1243,7 @@
         <w:rPr>
           <w:rFonts w:ascii="Arial" w:hAnsi="Arial" w:cs="Arial"/>
         </w:rPr>
-        <w:t>.</w:t>
-      </w:r>
-      <w:r>
-        <w:rPr>
-          <w:rFonts w:ascii="Arial" w:hAnsi="Arial" w:cs="Arial"/>
-        </w:rPr>
-        <w:t xml:space="preserve"> </w:t>
+        <w:t xml:space="preserve">. </w:t>
       </w:r>
       <w:r>
         <w:rPr>
@@ -2562,6 +2556,15 @@
         </w:rPr>
         <w:t>2018; 50(1):42-53</w:t>
       </w:r>
+      <w:r>
+        <w:rPr>
+          <w:rFonts w:ascii="Arial" w:hAnsi="Arial" w:cs="Arial"/>
+          <w:bCs/>
+          <w:szCs w:val="24"/>
+          <w:lang w:eastAsia="zh-CN"/>
+        </w:rPr>
+        <w:t>.</w:t>
+      </w:r>
     </w:p>
     <w:p>
       <w:pPr>
@@ -2626,6 +2629,14 @@
         </w:rPr>
         <w:t xml:space="preserve"> 2018; 102(1):88-102</w:t>
       </w:r>
+      <w:r>
+        <w:rPr>
+          <w:rFonts w:ascii="Arial" w:hAnsi="Arial" w:cs="Arial"/>
+          <w:bCs/>
+          <w:szCs w:val="24"/>
+        </w:rPr>
+        <w:t>.</w:t>
+      </w:r>
     </w:p>
     <w:p>
       <w:pPr>
@@ -2688,15 +2699,13 @@
         </w:rPr>
         <w:t xml:space="preserve">102(3):375-400. </w:t>
       </w:r>
-      <w:proofErr w:type="spellStart"/>
-      <w:r>
-        <w:rPr>
-          <w:rFonts w:ascii="Arial" w:hAnsi="Arial" w:cs="Arial"/>
-          <w:szCs w:val="24"/>
-        </w:rPr>
-        <w:t>doi</w:t>
-      </w:r>
-      <w:proofErr w:type="spellEnd"/>
+      <w:r>
+        <w:rPr>
+          <w:rFonts w:ascii="Arial" w:hAnsi="Arial" w:cs="Arial"/>
+          <w:szCs w:val="24"/>
+        </w:rPr>
+        <w:t>DOI</w:t>
+      </w:r>
       <w:r>
         <w:rPr>
           <w:rFonts w:ascii="Arial" w:hAnsi="Arial" w:cs="Arial"/>
@@ -2742,6 +2751,14 @@
           <w:szCs w:val="24"/>
         </w:rPr>
         <w:t xml:space="preserve"> 50:26-41</w:t>
+      </w:r>
+      <w:r>
+        <w:rPr>
+          <w:rFonts w:ascii="Arial" w:hAnsi="Arial" w:cs="Arial"/>
+          <w:color w:val="000000"/>
+          <w:szCs w:val="24"/>
+        </w:rPr>
+        <w:t>.</w:t>
       </w:r>
     </w:p>
     <w:p>
@@ -2805,7 +2822,6 @@
         </w:rPr>
         <w:t xml:space="preserve">85(6):1-27. </w:t>
       </w:r>
-      <w:proofErr w:type="spellStart"/>
       <w:r>
         <w:rPr>
           <w:rFonts w:ascii="Arial" w:hAnsi="Arial" w:cs="Arial"/>
@@ -2813,9 +2829,8 @@
           <w:szCs w:val="24"/>
           <w:lang w:eastAsia="zh-CN"/>
         </w:rPr>
-        <w:t>doi</w:t>
-      </w:r>
-      <w:proofErr w:type="spellEnd"/>
+        <w:t>DOI</w:t>
+      </w:r>
       <w:r>
         <w:rPr>
           <w:rFonts w:ascii="Arial" w:hAnsi="Arial" w:cs="Arial"/>
@@ -2824,6 +2839,15 @@
           <w:lang w:eastAsia="zh-CN"/>
         </w:rPr>
         <w:t>: 10.18637/jss.v085.i06</w:t>
+      </w:r>
+      <w:r>
+        <w:rPr>
+          <w:rFonts w:ascii="Arial" w:hAnsi="Arial" w:cs="Arial"/>
+          <w:iCs/>
+          <w:szCs w:val="24"/>
+          <w:lang w:eastAsia="zh-CN"/>
+        </w:rPr>
+        <w:t>.</w:t>
       </w:r>
     </w:p>
     <w:p>
@@ -2871,15 +2895,13 @@
         </w:rPr>
         <w:t xml:space="preserve"> 2018, 13(6):e0198166. </w:t>
       </w:r>
-      <w:proofErr w:type="spellStart"/>
-      <w:r>
-        <w:rPr>
-          <w:rFonts w:ascii="Arial" w:hAnsi="Arial" w:cs="Arial"/>
-          <w:szCs w:val="24"/>
-        </w:rPr>
-        <w:t>doi</w:t>
-      </w:r>
-      <w:proofErr w:type="spellEnd"/>
+      <w:r>
+        <w:rPr>
+          <w:rFonts w:ascii="Arial" w:hAnsi="Arial" w:cs="Arial"/>
+          <w:szCs w:val="24"/>
+        </w:rPr>
+        <w:t>DOI</w:t>
+      </w:r>
       <w:r>
         <w:rPr>
           <w:rFonts w:ascii="Arial" w:hAnsi="Arial" w:cs="Arial"/>
@@ -2945,7 +2967,15 @@
           <w:szCs w:val="24"/>
           <w:lang w:val="en-GB" w:eastAsia="zh-CN"/>
         </w:rPr>
-        <w:t>https://doi.org/10.1038/s41588-018-0147-3</w:t>
+        <w:t xml:space="preserve">DOI: </w:t>
+      </w:r>
+      <w:r>
+        <w:rPr>
+          <w:rFonts w:ascii="Arial" w:hAnsi="Arial" w:cs="Arial"/>
+          <w:szCs w:val="24"/>
+          <w:lang w:val="en-GB" w:eastAsia="zh-CN"/>
+        </w:rPr>
+        <w:t>10.1038/s41588-018-0147-3</w:t>
       </w:r>
       <w:r>
         <w:rPr>
@@ -3016,15 +3046,13 @@
         </w:rPr>
         <w:t xml:space="preserve">103(5):691-706. </w:t>
       </w:r>
-      <w:proofErr w:type="spellStart"/>
-      <w:r>
-        <w:rPr>
-          <w:rFonts w:ascii="Arial" w:hAnsi="Arial" w:cs="Arial"/>
-          <w:szCs w:val="24"/>
-        </w:rPr>
-        <w:t>doi</w:t>
-      </w:r>
-      <w:proofErr w:type="spellEnd"/>
+      <w:r>
+        <w:rPr>
+          <w:rFonts w:ascii="Arial" w:hAnsi="Arial" w:cs="Arial"/>
+          <w:szCs w:val="24"/>
+        </w:rPr>
+        <w:t>DOI</w:t>
+      </w:r>
       <w:r>
         <w:rPr>
           <w:rFonts w:ascii="Arial" w:hAnsi="Arial" w:cs="Arial"/>
@@ -3066,15 +3094,13 @@
         </w:rPr>
         <w:t xml:space="preserve"> 2018, 50(10):1412-1425. </w:t>
       </w:r>
-      <w:proofErr w:type="spellStart"/>
-      <w:r>
-        <w:rPr>
-          <w:rFonts w:ascii="Arial" w:hAnsi="Arial" w:cs="Arial"/>
-          <w:szCs w:val="24"/>
-        </w:rPr>
-        <w:t>doi</w:t>
-      </w:r>
-      <w:proofErr w:type="spellEnd"/>
+      <w:r>
+        <w:rPr>
+          <w:rFonts w:ascii="Arial" w:hAnsi="Arial" w:cs="Arial"/>
+          <w:szCs w:val="24"/>
+        </w:rPr>
+        <w:t>DOI</w:t>
+      </w:r>
       <w:r>
         <w:rPr>
           <w:rFonts w:ascii="Arial" w:hAnsi="Arial" w:cs="Arial"/>
@@ -3126,15 +3152,13 @@
         </w:rPr>
         <w:t xml:space="preserve"> 2018 Jul 9. </w:t>
       </w:r>
-      <w:proofErr w:type="spellStart"/>
-      <w:r>
-        <w:rPr>
-          <w:rFonts w:ascii="Arial" w:hAnsi="Arial" w:cs="Arial"/>
-          <w:szCs w:val="24"/>
-        </w:rPr>
-        <w:t>doi</w:t>
-      </w:r>
-      <w:proofErr w:type="spellEnd"/>
+      <w:r>
+        <w:rPr>
+          <w:rFonts w:ascii="Arial" w:hAnsi="Arial" w:cs="Arial"/>
+          <w:szCs w:val="24"/>
+        </w:rPr>
+        <w:t>DOI</w:t>
+      </w:r>
       <w:r>
         <w:rPr>
           <w:rFonts w:ascii="Arial" w:hAnsi="Arial" w:cs="Arial"/>
@@ -3183,7 +3207,21 @@
           <w:rFonts w:ascii="Arial" w:hAnsi="Arial" w:cs="Arial"/>
           <w:szCs w:val="24"/>
         </w:rPr>
-        <w:t xml:space="preserve"> 2019, 10, 376, https://doi.org/10.1038/s41467-018-08008-w.</w:t>
+        <w:t xml:space="preserve"> 2019, 10, 376, </w:t>
+      </w:r>
+      <w:r>
+        <w:rPr>
+          <w:rFonts w:ascii="Arial" w:hAnsi="Arial" w:cs="Arial"/>
+          <w:szCs w:val="24"/>
+        </w:rPr>
+        <w:t xml:space="preserve">DOI: </w:t>
+      </w:r>
+      <w:r>
+        <w:rPr>
+          <w:rFonts w:ascii="Arial" w:hAnsi="Arial" w:cs="Arial"/>
+          <w:szCs w:val="24"/>
+        </w:rPr>
+        <w:t>10.1038/s41467-018-08008-w.</w:t>
       </w:r>
     </w:p>
     <w:p>
@@ -3302,7 +3340,30 @@
           <w:rFonts w:ascii="Arial" w:hAnsi="Arial" w:cs="Arial"/>
           <w:szCs w:val="24"/>
         </w:rPr>
-        <w:t>https://doi.org/10.1093/ajcn/nqy272</w:t>
+        <w:t xml:space="preserve">DOI: </w:t>
+      </w:r>
+      <w:r>
+        <w:rPr>
+          <w:rFonts w:ascii="Arial" w:hAnsi="Arial" w:cs="Arial"/>
+          <w:szCs w:val="24"/>
+        </w:rPr>
+        <w:t>10.1093/</w:t>
+      </w:r>
+      <w:proofErr w:type="spellStart"/>
+      <w:r>
+        <w:rPr>
+          <w:rFonts w:ascii="Arial" w:hAnsi="Arial" w:cs="Arial"/>
+          <w:szCs w:val="24"/>
+        </w:rPr>
+        <w:t>ajcn</w:t>
+      </w:r>
+      <w:proofErr w:type="spellEnd"/>
+      <w:r>
+        <w:rPr>
+          <w:rFonts w:ascii="Arial" w:hAnsi="Arial" w:cs="Arial"/>
+          <w:szCs w:val="24"/>
+        </w:rPr>
+        <w:t>/nqy272</w:t>
       </w:r>
       <w:r>
         <w:rPr>
@@ -3377,7 +3438,30 @@
           <w:rFonts w:ascii="Arial" w:hAnsi="Arial" w:cs="Arial"/>
           <w:szCs w:val="24"/>
         </w:rPr>
-        <w:t>https://doi.org/10.1093/aje/kwz005.</w:t>
+        <w:t xml:space="preserve">DOI: </w:t>
+      </w:r>
+      <w:r>
+        <w:rPr>
+          <w:rFonts w:ascii="Arial" w:hAnsi="Arial" w:cs="Arial"/>
+          <w:szCs w:val="24"/>
+        </w:rPr>
+        <w:t>10.1093/</w:t>
+      </w:r>
+      <w:proofErr w:type="spellStart"/>
+      <w:r>
+        <w:rPr>
+          <w:rFonts w:ascii="Arial" w:hAnsi="Arial" w:cs="Arial"/>
+          <w:szCs w:val="24"/>
+        </w:rPr>
+        <w:t>aje</w:t>
+      </w:r>
+      <w:proofErr w:type="spellEnd"/>
+      <w:r>
+        <w:rPr>
+          <w:rFonts w:ascii="Arial" w:hAnsi="Arial" w:cs="Arial"/>
+          <w:szCs w:val="24"/>
+        </w:rPr>
+        <w:t>/kwz005.</w:t>
       </w:r>
     </w:p>
     <w:p>
@@ -3417,7 +3501,25 @@
           <w:szCs w:val="24"/>
           <w:lang w:eastAsia="zh-CN"/>
         </w:rPr>
-        <w:t>2019, https://doi.org/10.1038/s41588-018-0334-2.</w:t>
+        <w:t xml:space="preserve">2019, </w:t>
+      </w:r>
+      <w:r>
+        <w:rPr>
+          <w:rFonts w:ascii="Arial" w:hAnsi="Arial" w:cs="Arial"/>
+          <w:color w:val="000000"/>
+          <w:szCs w:val="24"/>
+          <w:lang w:eastAsia="zh-CN"/>
+        </w:rPr>
+        <w:t xml:space="preserve">DOI: </w:t>
+      </w:r>
+      <w:r>
+        <w:rPr>
+          <w:rFonts w:ascii="Arial" w:hAnsi="Arial" w:cs="Arial"/>
+          <w:color w:val="000000"/>
+          <w:szCs w:val="24"/>
+          <w:lang w:eastAsia="zh-CN"/>
+        </w:rPr>
+        <w:t>10.1038/s41588-018-0334-2.</w:t>
       </w:r>
     </w:p>
     <w:p>
@@ -3463,7 +3565,16 @@
           <w:szCs w:val="24"/>
           <w:lang w:eastAsia="zh-CN"/>
         </w:rPr>
-        <w:t>https://doi.org/10.1038/s41588-018-0321-7.</w:t>
+        <w:t xml:space="preserve">DOI: </w:t>
+      </w:r>
+      <w:r>
+        <w:rPr>
+          <w:rFonts w:ascii="Arial" w:hAnsi="Arial" w:cs="Arial"/>
+          <w:color w:val="000000"/>
+          <w:szCs w:val="24"/>
+          <w:lang w:eastAsia="zh-CN"/>
+        </w:rPr>
+        <w:t>10.1038/s41588-018-0321-7.</w:t>
       </w:r>
     </w:p>
     <w:p>
@@ -3526,7 +3637,28 @@
           <w:rFonts w:ascii="Arial" w:hAnsi="Arial" w:cs="Arial"/>
           <w:szCs w:val="24"/>
         </w:rPr>
-        <w:t>, Article number: 1534 (2019), https://www.nature.com/articles/s41467-019-09462-w</w:t>
+        <w:t xml:space="preserve">, Article number: 1534 (2019), </w:t>
+      </w:r>
+      <w:r>
+        <w:rPr>
+          <w:rFonts w:ascii="Arial" w:hAnsi="Arial" w:cs="Arial"/>
+          <w:szCs w:val="24"/>
+        </w:rPr>
+        <w:t xml:space="preserve">DOI: </w:t>
+      </w:r>
+      <w:r>
+        <w:rPr>
+          <w:rFonts w:ascii="Arial" w:hAnsi="Arial" w:cs="Arial"/>
+          <w:szCs w:val="24"/>
+        </w:rPr>
+        <w:t>10.1038/s41467-019-09462-w</w:t>
+      </w:r>
+      <w:r>
+        <w:rPr>
+          <w:rFonts w:ascii="Arial" w:hAnsi="Arial" w:cs="Arial"/>
+          <w:szCs w:val="24"/>
+        </w:rPr>
+        <w:t>.</w:t>
       </w:r>
     </w:p>
     <w:p>
@@ -3629,7 +3761,14 @@
           <w:rFonts w:ascii="Arial" w:hAnsi="Arial" w:cs="Arial"/>
           <w:szCs w:val="24"/>
         </w:rPr>
-        <w:t xml:space="preserve">/ddz070 </w:t>
+        <w:t>/ddz070</w:t>
+      </w:r>
+      <w:r>
+        <w:rPr>
+          <w:rFonts w:ascii="Arial" w:hAnsi="Arial" w:cs="Arial"/>
+          <w:szCs w:val="24"/>
+        </w:rPr>
+        <w:t>.</w:t>
       </w:r>
     </w:p>
     <w:p>
@@ -3717,6 +3856,14 @@
         </w:rPr>
         <w:t>NCOMMS-18-33232A-Z</w:t>
       </w:r>
+      <w:r>
+        <w:rPr>
+          <w:rStyle w:val="itwtqi23ioopmk3o6ert"/>
+          <w:rFonts w:ascii="Arial" w:hAnsi="Arial" w:cs="Arial"/>
+          <w:szCs w:val="24"/>
+        </w:rPr>
+        <w:t>.</w:t>
+      </w:r>
     </w:p>
     <w:p>
       <w:pPr>
@@ -3784,7 +3931,28 @@
           <w:rFonts w:ascii="Arial" w:hAnsi="Arial" w:cs="Arial"/>
           <w:szCs w:val="24"/>
         </w:rPr>
-        <w:t>636–648 (2019). https://doi.org/10.1038/s41588-019-0378-y</w:t>
+        <w:t xml:space="preserve">636–648 (2019). </w:t>
+      </w:r>
+      <w:r>
+        <w:rPr>
+          <w:rFonts w:ascii="Arial" w:hAnsi="Arial" w:cs="Arial"/>
+          <w:szCs w:val="24"/>
+        </w:rPr>
+        <w:t xml:space="preserve">DOI: </w:t>
+      </w:r>
+      <w:r>
+        <w:rPr>
+          <w:rFonts w:ascii="Arial" w:hAnsi="Arial" w:cs="Arial"/>
+          <w:szCs w:val="24"/>
+        </w:rPr>
+        <w:t>10.1038/s41588-019-0378-y</w:t>
+      </w:r>
+      <w:r>
+        <w:rPr>
+          <w:rFonts w:ascii="Arial" w:hAnsi="Arial" w:cs="Arial"/>
+          <w:szCs w:val="24"/>
+        </w:rPr>
+        <w:t>.</w:t>
       </w:r>
     </w:p>
     <w:p>
@@ -3841,7 +4009,47 @@
           <w:szCs w:val="24"/>
           <w:lang w:eastAsia="zh-CN"/>
         </w:rPr>
-        <w:t xml:space="preserve"> 2020, 11(1):163. Published 2020 Jan 9. doi:10.1038/s41467-019-13690-5</w:t>
+        <w:t xml:space="preserve"> 2020, 11(1):163. Published 2020 Jan 9. </w:t>
+      </w:r>
+      <w:r>
+        <w:rPr>
+          <w:rFonts w:ascii="Arial" w:eastAsia="Times New Roman" w:hAnsi="Arial" w:cs="Arial"/>
+          <w:szCs w:val="24"/>
+          <w:lang w:eastAsia="zh-CN"/>
+        </w:rPr>
+        <w:t>DOI</w:t>
+      </w:r>
+      <w:r>
+        <w:rPr>
+          <w:rFonts w:ascii="Arial" w:eastAsia="Times New Roman" w:hAnsi="Arial" w:cs="Arial"/>
+          <w:szCs w:val="24"/>
+          <w:lang w:eastAsia="zh-CN"/>
+        </w:rPr>
+        <w:t>:</w:t>
+      </w:r>
+      <w:r>
+        <w:rPr>
+          <w:rFonts w:ascii="Arial" w:eastAsia="Times New Roman" w:hAnsi="Arial" w:cs="Arial"/>
+          <w:szCs w:val="24"/>
+          <w:lang w:eastAsia="zh-CN"/>
+        </w:rPr>
+        <w:t xml:space="preserve"> </w:t>
+      </w:r>
+      <w:r>
+        <w:rPr>
+          <w:rFonts w:ascii="Arial" w:eastAsia="Times New Roman" w:hAnsi="Arial" w:cs="Arial"/>
+          <w:szCs w:val="24"/>
+          <w:lang w:eastAsia="zh-CN"/>
+        </w:rPr>
+        <w:t>10.1038/s41467-019-13690-5</w:t>
+      </w:r>
+      <w:r>
+        <w:rPr>
+          <w:rFonts w:ascii="Arial" w:eastAsia="Times New Roman" w:hAnsi="Arial" w:cs="Arial"/>
+          <w:szCs w:val="24"/>
+          <w:lang w:eastAsia="zh-CN"/>
+        </w:rPr>
+        <w:t>.</w:t>
       </w:r>
     </w:p>
     <w:p>
@@ -3881,16 +4089,14 @@
         </w:rPr>
         <w:t xml:space="preserve"> 2020, 52(12):1314-1332, </w:t>
       </w:r>
-      <w:proofErr w:type="spellStart"/>
       <w:r>
         <w:rPr>
           <w:rFonts w:ascii="Arial" w:eastAsia="Times New Roman" w:hAnsi="Arial" w:cs="Arial"/>
           <w:szCs w:val="24"/>
           <w:lang w:eastAsia="zh-CN"/>
         </w:rPr>
-        <w:t>doi</w:t>
-      </w:r>
-      <w:proofErr w:type="spellEnd"/>
+        <w:t>DOI</w:t>
+      </w:r>
       <w:r>
         <w:rPr>
           <w:rFonts w:ascii="Arial" w:eastAsia="Times New Roman" w:hAnsi="Arial" w:cs="Arial"/>
@@ -3955,7 +4161,31 @@
           <w:szCs w:val="24"/>
           <w:lang w:val="en"/>
         </w:rPr>
-        <w:t xml:space="preserve"> 2020, 11:556259, https://doi.org/10.3389/fgene.2020.556259</w:t>
+        <w:t xml:space="preserve"> 2020, 11:556259, </w:t>
+      </w:r>
+      <w:r>
+        <w:rPr>
+          <w:rFonts w:ascii="Arial" w:hAnsi="Arial" w:cs="Arial"/>
+          <w:szCs w:val="24"/>
+          <w:lang w:val="en"/>
+        </w:rPr>
+        <w:t xml:space="preserve">DOI: </w:t>
+      </w:r>
+      <w:r>
+        <w:rPr>
+          <w:rFonts w:ascii="Arial" w:hAnsi="Arial" w:cs="Arial"/>
+          <w:szCs w:val="24"/>
+          <w:lang w:val="en"/>
+        </w:rPr>
+        <w:t>10.3389/fgene.2020.556259</w:t>
+      </w:r>
+      <w:r>
+        <w:rPr>
+          <w:rFonts w:ascii="Arial" w:hAnsi="Arial" w:cs="Arial"/>
+          <w:szCs w:val="24"/>
+          <w:lang w:val="en"/>
+        </w:rPr>
+        <w:t>.</w:t>
       </w:r>
     </w:p>
     <w:p>
@@ -4275,7 +4505,14 @@
           <w:rFonts w:ascii="Arial" w:eastAsia="Times New Roman" w:hAnsi="Arial" w:cs="Arial"/>
           <w:szCs w:val="24"/>
         </w:rPr>
-        <w:t>https://doi.org/10.1016/j.ebiom.2021.103669</w:t>
+        <w:t xml:space="preserve">DOI: </w:t>
+      </w:r>
+      <w:r>
+        <w:rPr>
+          <w:rFonts w:ascii="Arial" w:eastAsia="Times New Roman" w:hAnsi="Arial" w:cs="Arial"/>
+          <w:szCs w:val="24"/>
+        </w:rPr>
+        <w:t>10.1016/j.ebiom.2021.103669</w:t>
       </w:r>
     </w:p>
     <w:p>
@@ -4353,6 +4590,13 @@
         </w:rPr>
         <w:t>10.1038/s41586-021-04064-3</w:t>
       </w:r>
+      <w:r>
+        <w:rPr>
+          <w:rFonts w:ascii="Arial" w:hAnsi="Arial" w:cs="Arial"/>
+          <w:szCs w:val="24"/>
+        </w:rPr>
+        <w:t>.</w:t>
+      </w:r>
     </w:p>
     <w:p>
       <w:pPr>
@@ -4386,7 +4630,28 @@
           <w:rFonts w:ascii="Arial" w:hAnsi="Arial" w:cs="Arial"/>
           <w:szCs w:val="24"/>
         </w:rPr>
-        <w:t xml:space="preserve"> (2022) 23:562, https://doi.org/10.1186/s12864-022-08809-w</w:t>
+        <w:t xml:space="preserve"> (2022) 23:562, </w:t>
+      </w:r>
+      <w:r>
+        <w:rPr>
+          <w:rFonts w:ascii="Arial" w:hAnsi="Arial" w:cs="Arial"/>
+          <w:szCs w:val="24"/>
+        </w:rPr>
+        <w:t xml:space="preserve">DOI: </w:t>
+      </w:r>
+      <w:r>
+        <w:rPr>
+          <w:rFonts w:ascii="Arial" w:hAnsi="Arial" w:cs="Arial"/>
+          <w:szCs w:val="24"/>
+        </w:rPr>
+        <w:t>10.1186/s12864-022-08809-w</w:t>
+      </w:r>
+      <w:r>
+        <w:rPr>
+          <w:rFonts w:ascii="Arial" w:hAnsi="Arial" w:cs="Arial"/>
+          <w:szCs w:val="24"/>
+        </w:rPr>
+        <w:t>.</w:t>
       </w:r>
     </w:p>
     <w:p>
@@ -4516,15 +4781,13 @@
         </w:rPr>
         <w:t xml:space="preserve">(8):1366-1387. </w:t>
       </w:r>
-      <w:proofErr w:type="spellStart"/>
-      <w:r>
-        <w:rPr>
-          <w:rFonts w:ascii="Arial" w:hAnsi="Arial" w:cs="Arial"/>
-          <w:szCs w:val="24"/>
-        </w:rPr>
-        <w:t>doi</w:t>
-      </w:r>
-      <w:proofErr w:type="spellEnd"/>
+      <w:r>
+        <w:rPr>
+          <w:rFonts w:ascii="Arial" w:hAnsi="Arial" w:cs="Arial"/>
+          <w:szCs w:val="24"/>
+        </w:rPr>
+        <w:t>DOI</w:t>
+      </w:r>
       <w:r>
         <w:rPr>
           <w:rFonts w:ascii="Arial" w:hAnsi="Arial" w:cs="Arial"/>
@@ -4976,7 +5239,19 @@
         <w:rPr>
           <w:rFonts w:ascii="Arial" w:hAnsi="Arial" w:cs="Arial"/>
         </w:rPr>
-        <w:t>https://www.nature.com/articles/s41467-023-39521-2</w:t>
+        <w:t xml:space="preserve">DOI: </w:t>
+      </w:r>
+      <w:r>
+        <w:rPr>
+          <w:rFonts w:ascii="Arial" w:hAnsi="Arial" w:cs="Arial"/>
+        </w:rPr>
+        <w:t>10.1038/s41467-023-39521-2</w:t>
+      </w:r>
+      <w:r>
+        <w:rPr>
+          <w:rFonts w:ascii="Arial" w:hAnsi="Arial" w:cs="Arial"/>
+        </w:rPr>
+        <w:t>.</w:t>
       </w:r>
     </w:p>
     <w:p>
@@ -5041,13 +5316,20 @@
       </w:r>
       <w:r>
         <w:rPr>
+          <w:rFonts w:ascii="Arial" w:hAnsi="Arial" w:cs="Arial"/>
           <w:b/>
           <w:bCs/>
         </w:rPr>
         <w:t>24</w:t>
       </w:r>
       <w:r>
-        <w:t xml:space="preserve">(9):1540-1551, </w:t>
+        <w:rPr>
+          <w:rFonts w:ascii="Arial" w:hAnsi="Arial" w:cs="Arial"/>
+        </w:rPr>
+        <w:t>(9):1540-1551</w:t>
+      </w:r>
+      <w:r>
+        <w:t xml:space="preserve">, </w:t>
       </w:r>
       <w:r>
         <w:rPr>
@@ -5056,7 +5338,7 @@
           <w:sz w:val="22"/>
           <w:szCs w:val="22"/>
         </w:rPr>
-        <w:t xml:space="preserve">10.1038/s41590-023-01588-w, </w:t>
+        <w:t xml:space="preserve">DOI: </w:t>
       </w:r>
       <w:r>
         <w:rPr>
@@ -5064,7 +5346,15 @@
           <w:color w:val="212121"/>
           <w:szCs w:val="24"/>
         </w:rPr>
-        <w:t>https://www.nature.com/articles/s41590-023-01588-w.</w:t>
+        <w:t>10.1038/s41590-023-01588-w</w:t>
+      </w:r>
+      <w:r>
+        <w:rPr>
+          <w:rFonts w:ascii="Arial" w:hAnsi="Arial" w:cs="Arial"/>
+          <w:color w:val="212121"/>
+          <w:szCs w:val="24"/>
+        </w:rPr>
+        <w:t>.</w:t>
       </w:r>
     </w:p>
     <w:p>
@@ -5126,7 +5416,25 @@
         <w:rPr>
           <w:rFonts w:ascii="Arial" w:hAnsi="Arial" w:cs="Arial"/>
         </w:rPr>
-        <w:t>:1448–1461 (2023), https://www.nature.com/articles/s41588-023-01462-3,</w:t>
+        <w:t xml:space="preserve">:1448–1461 (2023), </w:t>
+      </w:r>
+      <w:r>
+        <w:rPr>
+          <w:rFonts w:ascii="Arial" w:hAnsi="Arial" w:cs="Arial"/>
+        </w:rPr>
+        <w:t xml:space="preserve">DOI: </w:t>
+      </w:r>
+      <w:r>
+        <w:rPr>
+          <w:rFonts w:ascii="Arial" w:hAnsi="Arial" w:cs="Arial"/>
+        </w:rPr>
+        <w:t>10.1038/s41588-023-01462-3</w:t>
+      </w:r>
+      <w:r>
+        <w:rPr>
+          <w:rFonts w:ascii="Arial" w:hAnsi="Arial" w:cs="Arial"/>
+        </w:rPr>
+        <w:t>,</w:t>
       </w:r>
       <w:r>
         <w:rPr>
@@ -5608,7 +5916,14 @@
           <w:rFonts w:ascii="Arial" w:hAnsi="Arial" w:cs="Arial"/>
           <w:szCs w:val="24"/>
         </w:rPr>
-        <w:t>https://www.nature.com/articles/s41591-025-03827-z</w:t>
+        <w:t xml:space="preserve">DOI: </w:t>
+      </w:r>
+      <w:r>
+        <w:rPr>
+          <w:rFonts w:ascii="Arial" w:hAnsi="Arial" w:cs="Arial"/>
+          <w:szCs w:val="24"/>
+        </w:rPr>
+        <w:t>10.1038/s41591-025-03827-z</w:t>
       </w:r>
       <w:r>
         <w:rPr>
@@ -5733,14 +6048,63 @@
           <w:szCs w:val="24"/>
           <w:lang w:val="en-GB"/>
         </w:rPr>
-        <w:t>Proteogenomic evidence for pathways, cell-types and tissues modulating the circulating proteome</w:t>
-      </w:r>
+        <w:t xml:space="preserve">Multi-cohort proteogenomic analyses reveal genetic effects across the proteome and </w:t>
+      </w:r>
+      <w:proofErr w:type="spellStart"/>
+      <w:r>
+        <w:rPr>
+          <w:rFonts w:ascii="Arial" w:hAnsi="Arial" w:cs="Arial"/>
+          <w:szCs w:val="24"/>
+          <w:lang w:val="en-GB"/>
+        </w:rPr>
+        <w:t>diseasome</w:t>
+      </w:r>
+      <w:proofErr w:type="spellEnd"/>
       <w:r>
         <w:rPr>
           <w:rFonts w:ascii="Arial" w:hAnsi="Arial" w:cs="Arial"/>
           <w:szCs w:val="24"/>
         </w:rPr>
         <w:t>.</w:t>
+      </w:r>
+      <w:r>
+        <w:rPr>
+          <w:rFonts w:ascii="Arial" w:hAnsi="Arial" w:cs="Arial"/>
+        </w:rPr>
+        <w:t xml:space="preserve"> </w:t>
+      </w:r>
+      <w:r>
+        <w:rPr>
+          <w:rFonts w:ascii="Arial" w:hAnsi="Arial" w:cs="Arial"/>
+          <w:i/>
+          <w:iCs/>
+        </w:rPr>
+        <w:t xml:space="preserve">Cell </w:t>
+      </w:r>
+      <w:r>
+        <w:rPr>
+          <w:rFonts w:ascii="Arial" w:hAnsi="Arial" w:cs="Arial"/>
+        </w:rPr>
+        <w:t>(2026)</w:t>
+      </w:r>
+      <w:r>
+        <w:rPr>
+          <w:rFonts w:ascii="Arial" w:hAnsi="Arial" w:cs="Arial"/>
+        </w:rPr>
+        <w:t>.</w:t>
+      </w:r>
+      <w:r>
+        <w:rPr>
+          <w:rFonts w:ascii="Arial" w:hAnsi="Arial" w:cs="Arial"/>
+        </w:rPr>
+        <w:t xml:space="preserve"> </w:t>
+      </w:r>
+      <w:r>
+        <w:rPr>
+          <w:rFonts w:ascii="Arial" w:hAnsi="Arial" w:cs="Arial"/>
+          <w:szCs w:val="24"/>
+        </w:rPr>
+        <w:t>DOI: 10.1016/j.cell.2026.03.049.</w:t>
       </w:r>
     </w:p>
     <w:p>

</xml_diff>

<commit_message>
Deploy site 2026-07-15 15:59:02
</commit_message>
<xml_diff>
--- a/cv.docx
+++ b/cv.docx
@@ -17,6 +17,14 @@
           <w:szCs w:val="24"/>
         </w:rPr>
         <w:t>CURRICULUM VITAE</w:t>
+      </w:r>
+      <w:r>
+        <w:rPr>
+          <w:rFonts w:ascii="Arial" w:hAnsi="Arial" w:cs="Arial"/>
+          <w:b/>
+          <w:szCs w:val="24"/>
+        </w:rPr>
+        <w:t xml:space="preserve"> of Jing Hua Zhao</w:t>
       </w:r>
     </w:p>
     <w:p>
@@ -88,22 +96,6 @@
         <w:rPr>
           <w:rFonts w:ascii="Arial" w:hAnsi="Arial" w:cs="Arial"/>
           <w:szCs w:val="24"/>
-        </w:rPr>
-      </w:pPr>
-      <w:r>
-        <w:rPr>
-          <w:rFonts w:ascii="Arial" w:hAnsi="Arial" w:cs="Arial"/>
-          <w:szCs w:val="24"/>
-        </w:rPr>
-        <w:t>Jing Hua Zhao</w:t>
-      </w:r>
-    </w:p>
-    <w:p>
-      <w:pPr>
-        <w:jc w:val="both"/>
-        <w:rPr>
-          <w:rFonts w:ascii="Arial" w:hAnsi="Arial" w:cs="Arial"/>
-          <w:szCs w:val="24"/>
           <w:lang w:val="en-GB"/>
         </w:rPr>
       </w:pPr>
@@ -124,16 +116,14 @@
         </w:rPr>
         <w:t>jinghuazhao@hotmail.com</w:t>
       </w:r>
-    </w:p>
-    <w:p>
-      <w:pPr>
-        <w:jc w:val="both"/>
+      <w:r>
         <w:rPr>
           <w:rFonts w:ascii="Arial" w:hAnsi="Arial" w:cs="Arial"/>
           <w:szCs w:val="24"/>
           <w:lang w:val="en-GB"/>
         </w:rPr>
-      </w:pPr>
+        <w:t xml:space="preserve">; </w:t>
+      </w:r>
       <w:r>
         <w:rPr>
           <w:rFonts w:ascii="Arial" w:hAnsi="Arial" w:cs="Arial"/>
@@ -171,6 +161,7 @@
         <w:rPr>
           <w:rFonts w:ascii="Arial" w:hAnsi="Arial" w:cs="Arial"/>
           <w:szCs w:val="24"/>
+          <w:lang w:val="en-GB"/>
         </w:rPr>
       </w:pPr>
     </w:p>
@@ -489,42 +480,21 @@
           <w:rFonts w:ascii="Arial" w:hAnsi="Arial" w:cs="Arial"/>
           <w:szCs w:val="24"/>
         </w:rPr>
-        <w:t xml:space="preserve">My work </w:t>
-      </w:r>
-      <w:r>
-        <w:rPr>
-          <w:rFonts w:ascii="Arial" w:hAnsi="Arial" w:cs="Arial"/>
-          <w:szCs w:val="24"/>
-        </w:rPr>
-        <w:t xml:space="preserve">is </w:t>
-      </w:r>
-      <w:r>
-        <w:rPr>
-          <w:rFonts w:ascii="Arial" w:hAnsi="Arial" w:cs="Arial"/>
-          <w:szCs w:val="24"/>
-        </w:rPr>
-        <w:t xml:space="preserve">human health-related </w:t>
-      </w:r>
-      <w:r>
-        <w:rPr>
-          <w:rFonts w:ascii="Arial" w:hAnsi="Arial" w:cs="Arial"/>
-          <w:szCs w:val="24"/>
-        </w:rPr>
-        <w:t xml:space="preserve">research which </w:t>
-      </w:r>
-      <w:r>
-        <w:rPr>
-          <w:rFonts w:ascii="Arial" w:hAnsi="Arial" w:cs="Arial"/>
-          <w:szCs w:val="24"/>
-        </w:rPr>
-        <w:t>over years includ</w:t>
-      </w:r>
-      <w:r>
-        <w:rPr>
-          <w:rFonts w:ascii="Arial" w:hAnsi="Arial" w:cs="Arial"/>
-          <w:szCs w:val="24"/>
-        </w:rPr>
-        <w:t>es</w:t>
+        <w:t xml:space="preserve">I </w:t>
+      </w:r>
+      <w:r>
+        <w:rPr>
+          <w:rFonts w:ascii="Arial" w:hAnsi="Arial" w:cs="Arial"/>
+          <w:szCs w:val="24"/>
+        </w:rPr>
+        <w:t xml:space="preserve">work </w:t>
+      </w:r>
+      <w:r>
+        <w:rPr>
+          <w:rFonts w:ascii="Arial" w:hAnsi="Arial" w:cs="Arial"/>
+          <w:szCs w:val="24"/>
+        </w:rPr>
+        <w:t>on</w:t>
       </w:r>
       <w:r>
         <w:rPr>
@@ -538,6 +508,62 @@
           <w:rFonts w:ascii="Arial" w:hAnsi="Arial" w:cs="Arial"/>
           <w:szCs w:val="24"/>
         </w:rPr>
+        <w:t xml:space="preserve">human </w:t>
+      </w:r>
+      <w:r>
+        <w:rPr>
+          <w:rFonts w:ascii="Arial" w:hAnsi="Arial" w:cs="Arial"/>
+          <w:szCs w:val="24"/>
+        </w:rPr>
+        <w:t>genetics</w:t>
+      </w:r>
+      <w:r>
+        <w:rPr>
+          <w:rFonts w:ascii="Arial" w:hAnsi="Arial" w:cs="Arial"/>
+          <w:szCs w:val="24"/>
+        </w:rPr>
+        <w:t>,</w:t>
+      </w:r>
+      <w:r>
+        <w:rPr>
+          <w:rFonts w:ascii="Arial" w:hAnsi="Arial" w:cs="Arial"/>
+          <w:szCs w:val="24"/>
+        </w:rPr>
+        <w:t xml:space="preserve"> </w:t>
+      </w:r>
+      <w:r>
+        <w:rPr>
+          <w:rFonts w:ascii="Arial" w:hAnsi="Arial" w:cs="Arial"/>
+          <w:szCs w:val="24"/>
+        </w:rPr>
+        <w:t xml:space="preserve">over years </w:t>
+      </w:r>
+      <w:r>
+        <w:rPr>
+          <w:rFonts w:ascii="Arial" w:hAnsi="Arial" w:cs="Arial"/>
+          <w:szCs w:val="24"/>
+        </w:rPr>
+        <w:t>evolving</w:t>
+      </w:r>
+      <w:r>
+        <w:rPr>
+          <w:rFonts w:ascii="Arial" w:hAnsi="Arial" w:cs="Arial"/>
+          <w:szCs w:val="24"/>
+        </w:rPr>
+        <w:t xml:space="preserve"> </w:t>
+      </w:r>
+      <w:r>
+        <w:rPr>
+          <w:rFonts w:ascii="Arial" w:hAnsi="Arial" w:cs="Arial"/>
+          <w:szCs w:val="24"/>
+        </w:rPr>
+        <w:t xml:space="preserve">from </w:t>
+      </w:r>
+      <w:r>
+        <w:rPr>
+          <w:rFonts w:ascii="Arial" w:hAnsi="Arial" w:cs="Arial"/>
+          <w:szCs w:val="24"/>
+        </w:rPr>
         <w:t>familial aggregation, segregation</w:t>
       </w:r>
       <w:r>
@@ -596,7 +622,49 @@
           <w:rFonts w:ascii="Arial" w:hAnsi="Arial" w:cs="Arial"/>
           <w:szCs w:val="24"/>
         </w:rPr>
-        <w:t xml:space="preserve">). The most recent is </w:t>
+        <w:t>)</w:t>
+      </w:r>
+      <w:r>
+        <w:rPr>
+          <w:rFonts w:ascii="Arial" w:hAnsi="Arial" w:cs="Arial"/>
+          <w:szCs w:val="24"/>
+        </w:rPr>
+        <w:t xml:space="preserve"> </w:t>
+      </w:r>
+      <w:r>
+        <w:rPr>
+          <w:rFonts w:ascii="Arial" w:hAnsi="Arial" w:cs="Arial"/>
+          <w:szCs w:val="24"/>
+        </w:rPr>
+        <w:t xml:space="preserve">to </w:t>
+      </w:r>
+      <w:r>
+        <w:rPr>
+          <w:rFonts w:ascii="Arial" w:hAnsi="Arial" w:cs="Arial"/>
+          <w:szCs w:val="24"/>
+        </w:rPr>
+        <w:t xml:space="preserve">a </w:t>
+      </w:r>
+      <w:r>
+        <w:rPr>
+          <w:rFonts w:ascii="Arial" w:hAnsi="Arial" w:cs="Arial"/>
+          <w:szCs w:val="24"/>
+        </w:rPr>
+        <w:t xml:space="preserve">recent </w:t>
+      </w:r>
+      <w:r>
+        <w:rPr>
+          <w:rFonts w:ascii="Arial" w:hAnsi="Arial" w:cs="Arial"/>
+          <w:szCs w:val="24"/>
+        </w:rPr>
+        <w:t>focus on</w:t>
+      </w:r>
+      <w:r>
+        <w:rPr>
+          <w:rFonts w:ascii="Arial" w:hAnsi="Arial" w:cs="Arial"/>
+          <w:szCs w:val="24"/>
+        </w:rPr>
+        <w:t xml:space="preserve"> </w:t>
       </w:r>
       <w:proofErr w:type="spellStart"/>
       <w:r>
@@ -612,7 +680,21 @@
           <w:rFonts w:ascii="Arial" w:hAnsi="Arial" w:cs="Arial"/>
           <w:szCs w:val="24"/>
         </w:rPr>
-        <w:t xml:space="preserve"> within the SCALLOP consortium using </w:t>
+        <w:t xml:space="preserve"> within the SCALLOP consortium </w:t>
+      </w:r>
+      <w:r>
+        <w:rPr>
+          <w:rFonts w:ascii="Arial" w:hAnsi="Arial" w:cs="Arial"/>
+          <w:szCs w:val="24"/>
+        </w:rPr>
+        <w:t xml:space="preserve">and other projects </w:t>
+      </w:r>
+      <w:r>
+        <w:rPr>
+          <w:rFonts w:ascii="Arial" w:hAnsi="Arial" w:cs="Arial"/>
+          <w:szCs w:val="24"/>
+        </w:rPr>
+        <w:t xml:space="preserve">using </w:t>
       </w:r>
       <w:proofErr w:type="spellStart"/>
       <w:r>
@@ -677,21 +759,7 @@
           <w:rFonts w:ascii="Arial" w:hAnsi="Arial" w:cs="Arial"/>
           <w:szCs w:val="24"/>
         </w:rPr>
-        <w:t xml:space="preserve">. I have </w:t>
-      </w:r>
-      <w:r>
-        <w:rPr>
-          <w:rFonts w:ascii="Arial" w:hAnsi="Arial" w:cs="Arial"/>
-          <w:szCs w:val="24"/>
-        </w:rPr>
-        <w:t xml:space="preserve">also </w:t>
-      </w:r>
-      <w:r>
-        <w:rPr>
-          <w:rFonts w:ascii="Arial" w:hAnsi="Arial" w:cs="Arial"/>
-          <w:szCs w:val="24"/>
-        </w:rPr>
-        <w:t xml:space="preserve">led collaborative </w:t>
+        <w:t xml:space="preserve">. I led collaborative </w:t>
       </w:r>
       <w:r>
         <w:rPr>
@@ -757,6 +825,13 @@
           <w:szCs w:val="24"/>
         </w:rPr>
         <w:t>Initiative.</w:t>
+      </w:r>
+      <w:r>
+        <w:rPr>
+          <w:rFonts w:ascii="Arial" w:hAnsi="Arial" w:cs="Arial"/>
+          <w:szCs w:val="24"/>
+        </w:rPr>
+        <w:t xml:space="preserve"> </w:t>
       </w:r>
     </w:p>
     <w:p>
@@ -777,6 +852,7 @@
         <w:adjustRightInd w:val="0"/>
         <w:rPr>
           <w:rFonts w:ascii="Arial" w:hAnsi="Arial" w:cs="Arial"/>
+          <w:szCs w:val="24"/>
         </w:rPr>
       </w:pPr>
       <w:r>
@@ -791,14 +867,35 @@
           <w:rFonts w:ascii="Arial" w:hAnsi="Arial" w:cs="Arial"/>
           <w:szCs w:val="24"/>
         </w:rPr>
-        <w:t>via</w:t>
-      </w:r>
-      <w:r>
-        <w:rPr>
-          <w:rFonts w:ascii="Arial" w:hAnsi="Arial" w:cs="Arial"/>
-          <w:szCs w:val="24"/>
-        </w:rPr>
-        <w:t xml:space="preserve"> CRAN (https://cran.r-project.org)</w:t>
+        <w:t xml:space="preserve">as </w:t>
+      </w:r>
+      <w:r>
+        <w:rPr>
+          <w:rFonts w:ascii="Arial" w:hAnsi="Arial" w:cs="Arial"/>
+          <w:szCs w:val="24"/>
+        </w:rPr>
+        <w:t xml:space="preserve">in </w:t>
+      </w:r>
+      <w:r>
+        <w:rPr>
+          <w:rFonts w:ascii="Arial" w:hAnsi="Arial" w:cs="Arial"/>
+          <w:szCs w:val="24"/>
+        </w:rPr>
+        <w:t>https://jinghuazhao.github.io/</w:t>
+      </w:r>
+      <w:r>
+        <w:rPr>
+          <w:rFonts w:ascii="Arial" w:hAnsi="Arial" w:cs="Arial"/>
+          <w:szCs w:val="24"/>
+        </w:rPr>
+        <w:t>[</w:t>
+      </w:r>
+      <w:r>
+        <w:rPr>
+          <w:rFonts w:ascii="Arial" w:hAnsi="Arial" w:cs="Arial"/>
+          <w:szCs w:val="24"/>
+        </w:rPr>
+        <w:t>software</w:t>
       </w:r>
       <w:r>
         <w:rPr>
@@ -812,21 +909,14 @@
           <w:rFonts w:ascii="Arial" w:hAnsi="Arial" w:cs="Arial"/>
           <w:szCs w:val="24"/>
         </w:rPr>
-        <w:t xml:space="preserve"> GitHub (https://github.com) and</w:t>
-      </w:r>
-      <w:r>
-        <w:rPr>
-          <w:rFonts w:ascii="Arial" w:hAnsi="Arial" w:cs="Arial"/>
-          <w:szCs w:val="24"/>
-        </w:rPr>
-        <w:t xml:space="preserve"> website</w:t>
-      </w:r>
-      <w:r>
-        <w:rPr>
-          <w:rFonts w:ascii="Arial" w:hAnsi="Arial" w:cs="Arial"/>
-          <w:szCs w:val="24"/>
-        </w:rPr>
-        <w:t>s, notably</w:t>
+        <w:t>Computational-Statistics</w:t>
+      </w:r>
+      <w:r>
+        <w:rPr>
+          <w:rFonts w:ascii="Arial" w:hAnsi="Arial" w:cs="Arial"/>
+          <w:szCs w:val="24"/>
+        </w:rPr>
+        <w:t>/,</w:t>
       </w:r>
       <w:r>
         <w:rPr>
@@ -840,7 +930,35 @@
           <w:rFonts w:ascii="Arial" w:hAnsi="Arial" w:cs="Arial"/>
           <w:szCs w:val="24"/>
         </w:rPr>
-        <w:t>genetic analysis package (gap)</w:t>
+        <w:t>Omics-analysis/</w:t>
+      </w:r>
+      <w:r>
+        <w:rPr>
+          <w:rFonts w:ascii="Arial" w:hAnsi="Arial" w:cs="Arial"/>
+          <w:szCs w:val="24"/>
+        </w:rPr>
+        <w:t>]</w:t>
+      </w:r>
+      <w:r>
+        <w:rPr>
+          <w:rFonts w:ascii="Arial" w:hAnsi="Arial" w:cs="Arial"/>
+          <w:szCs w:val="24"/>
+        </w:rPr>
+        <w:t xml:space="preserve"> and</w:t>
+      </w:r>
+      <w:r>
+        <w:rPr>
+          <w:rFonts w:ascii="Arial" w:hAnsi="Arial" w:cs="Arial"/>
+          <w:szCs w:val="24"/>
+        </w:rPr>
+        <w:t xml:space="preserve"> </w:t>
+      </w:r>
+      <w:r>
+        <w:rPr>
+          <w:rFonts w:ascii="Arial" w:hAnsi="Arial" w:cs="Arial"/>
+          <w:szCs w:val="24"/>
+        </w:rPr>
+        <w:t>https://cambridge-ceu.github.io/csd3/systems/ceuadmin.html</w:t>
       </w:r>
       <w:r>
         <w:rPr>
@@ -861,7 +979,43 @@
           <w:rFonts w:ascii="Arial" w:hAnsi="Arial" w:cs="Arial"/>
           <w:szCs w:val="24"/>
         </w:rPr>
-        <w:t>protein quantitative trait tools (</w:t>
+        <w:t xml:space="preserve">involving aspects on </w:t>
+      </w:r>
+    </w:p>
+    <w:p>
+      <w:pPr>
+        <w:pStyle w:val="ListParagraph"/>
+        <w:numPr>
+          <w:ilvl w:val="0"/>
+          <w:numId w:val="32"/>
+        </w:numPr>
+        <w:autoSpaceDE w:val="0"/>
+        <w:autoSpaceDN w:val="0"/>
+        <w:adjustRightInd w:val="0"/>
+        <w:rPr>
+          <w:rFonts w:ascii="Arial" w:hAnsi="Arial" w:cs="Arial"/>
+        </w:rPr>
+      </w:pPr>
+      <w:r>
+        <w:rPr>
+          <w:rFonts w:ascii="Arial" w:hAnsi="Arial" w:cs="Arial"/>
+          <w:szCs w:val="24"/>
+        </w:rPr>
+        <w:t>AI</w:t>
+      </w:r>
+      <w:r>
+        <w:rPr>
+          <w:rFonts w:ascii="Arial" w:hAnsi="Arial" w:cs="Arial"/>
+          <w:szCs w:val="24"/>
+        </w:rPr>
+        <w:t>:</w:t>
+      </w:r>
+      <w:r>
+        <w:rPr>
+          <w:rFonts w:ascii="Arial" w:hAnsi="Arial" w:cs="Arial"/>
+          <w:szCs w:val="24"/>
+        </w:rPr>
+        <w:t xml:space="preserve"> </w:t>
       </w:r>
       <w:proofErr w:type="spellStart"/>
       <w:r>
@@ -869,7 +1023,7 @@
           <w:rFonts w:ascii="Arial" w:hAnsi="Arial" w:cs="Arial"/>
           <w:szCs w:val="24"/>
         </w:rPr>
-        <w:t>pQTLtools</w:t>
+        <w:t>BitNet</w:t>
       </w:r>
       <w:proofErr w:type="spellEnd"/>
       <w:r>
@@ -877,7 +1031,14 @@
           <w:rFonts w:ascii="Arial" w:hAnsi="Arial" w:cs="Arial"/>
           <w:szCs w:val="24"/>
         </w:rPr>
-        <w:t>)</w:t>
+        <w:t xml:space="preserve">, </w:t>
+      </w:r>
+      <w:r>
+        <w:rPr>
+          <w:rFonts w:ascii="Arial" w:hAnsi="Arial" w:cs="Arial"/>
+          <w:szCs w:val="24"/>
+        </w:rPr>
+        <w:t>Claude Code,</w:t>
       </w:r>
       <w:r>
         <w:rPr>
@@ -886,19 +1047,81 @@
         </w:rPr>
         <w:t xml:space="preserve"> </w:t>
       </w:r>
-      <w:r>
-        <w:rPr>
-          <w:rFonts w:ascii="Arial" w:hAnsi="Arial" w:cs="Arial"/>
-          <w:szCs w:val="24"/>
-        </w:rPr>
-        <w:t xml:space="preserve">and </w:t>
-      </w:r>
-      <w:r>
-        <w:rPr>
-          <w:rFonts w:ascii="Arial" w:hAnsi="Arial" w:cs="Arial"/>
-          <w:szCs w:val="24"/>
-        </w:rPr>
-        <w:t>sites</w:t>
+      <w:proofErr w:type="spellStart"/>
+      <w:r>
+        <w:rPr>
+          <w:rFonts w:ascii="Arial" w:hAnsi="Arial" w:cs="Arial"/>
+          <w:szCs w:val="24"/>
+        </w:rPr>
+        <w:t>Ollama</w:t>
+      </w:r>
+      <w:proofErr w:type="spellEnd"/>
+      <w:r>
+        <w:rPr>
+          <w:rFonts w:ascii="Arial" w:hAnsi="Arial" w:cs="Arial"/>
+          <w:szCs w:val="24"/>
+        </w:rPr>
+        <w:t xml:space="preserve">, </w:t>
+      </w:r>
+      <w:r>
+        <w:rPr>
+          <w:rFonts w:ascii="Arial" w:hAnsi="Arial" w:cs="Arial"/>
+          <w:szCs w:val="24"/>
+        </w:rPr>
+        <w:t>OpenClaw</w:t>
+      </w:r>
+      <w:r>
+        <w:rPr>
+          <w:rFonts w:ascii="Arial" w:hAnsi="Arial" w:cs="Arial"/>
+          <w:szCs w:val="24"/>
+        </w:rPr>
+        <w:t xml:space="preserve">, </w:t>
+      </w:r>
+      <w:r>
+        <w:rPr>
+          <w:rFonts w:ascii="Arial" w:hAnsi="Arial" w:cs="Arial"/>
+          <w:szCs w:val="24"/>
+        </w:rPr>
+        <w:t xml:space="preserve">codex-cli, copilot-cli, </w:t>
+      </w:r>
+      <w:proofErr w:type="spellStart"/>
+      <w:r>
+        <w:rPr>
+          <w:rFonts w:ascii="Arial" w:hAnsi="Arial" w:cs="Arial"/>
+          <w:szCs w:val="24"/>
+        </w:rPr>
+        <w:t>gemini</w:t>
+      </w:r>
+      <w:proofErr w:type="spellEnd"/>
+      <w:r>
+        <w:rPr>
+          <w:rFonts w:ascii="Arial" w:hAnsi="Arial" w:cs="Arial"/>
+          <w:szCs w:val="24"/>
+        </w:rPr>
+        <w:t xml:space="preserve">-cli, </w:t>
+      </w:r>
+      <w:proofErr w:type="spellStart"/>
+      <w:r>
+        <w:rPr>
+          <w:rFonts w:ascii="Arial" w:hAnsi="Arial" w:cs="Arial"/>
+          <w:szCs w:val="24"/>
+        </w:rPr>
+        <w:t>hermes</w:t>
+      </w:r>
+      <w:proofErr w:type="spellEnd"/>
+      <w:r>
+        <w:rPr>
+          <w:rFonts w:ascii="Arial" w:hAnsi="Arial" w:cs="Arial"/>
+          <w:szCs w:val="24"/>
+        </w:rPr>
+        <w:t xml:space="preserve">-agent, </w:t>
+      </w:r>
+      <w:r>
+        <w:rPr>
+          <w:rFonts w:ascii="Arial" w:hAnsi="Arial" w:cs="Arial"/>
+          <w:szCs w:val="24"/>
+        </w:rPr>
+        <w:t>llama.cpp</w:t>
       </w:r>
       <w:r>
         <w:rPr>
@@ -912,620 +1135,444 @@
           <w:rFonts w:ascii="Arial" w:hAnsi="Arial" w:cs="Arial"/>
           <w:szCs w:val="24"/>
         </w:rPr>
-        <w:t>https://jinghuazhao.github.io/Computational-Statistics/</w:t>
-      </w:r>
-      <w:r>
-        <w:rPr>
-          <w:rFonts w:ascii="Arial" w:hAnsi="Arial" w:cs="Arial"/>
-          <w:szCs w:val="24"/>
-        </w:rPr>
-        <w:t xml:space="preserve"> and </w:t>
-      </w:r>
-      <w:r>
-        <w:rPr>
-          <w:rFonts w:ascii="Arial" w:hAnsi="Arial" w:cs="Arial"/>
-          <w:szCs w:val="24"/>
-        </w:rPr>
-        <w:t>https://jinghuazhao.github.io/Omics-analysis/</w:t>
-      </w:r>
-      <w:r>
-        <w:rPr>
-          <w:rFonts w:ascii="Arial" w:hAnsi="Arial" w:cs="Arial"/>
-          <w:szCs w:val="24"/>
-        </w:rPr>
-        <w:t>.</w:t>
-      </w:r>
-      <w:r>
-        <w:rPr>
-          <w:rFonts w:ascii="Arial" w:hAnsi="Arial" w:cs="Arial"/>
-          <w:szCs w:val="24"/>
+        <w:t xml:space="preserve">as with </w:t>
+      </w:r>
+      <w:r>
+        <w:rPr>
+          <w:rFonts w:ascii="Arial" w:hAnsi="Arial" w:cs="Arial"/>
+        </w:rPr>
+        <w:t xml:space="preserve">models, platforms and libraries such as TensorFlow, </w:t>
+      </w:r>
+      <w:proofErr w:type="spellStart"/>
+      <w:r>
+        <w:rPr>
+          <w:rFonts w:ascii="Arial" w:hAnsi="Arial" w:cs="Arial"/>
+        </w:rPr>
+        <w:t>PyTorch</w:t>
+      </w:r>
+      <w:proofErr w:type="spellEnd"/>
+      <w:r>
+        <w:rPr>
+          <w:rFonts w:ascii="Arial" w:hAnsi="Arial" w:cs="Arial"/>
+        </w:rPr>
+        <w:t>, scikit-</w:t>
+      </w:r>
+      <w:proofErr w:type="spellStart"/>
+      <w:r>
+        <w:rPr>
+          <w:rFonts w:ascii="Arial" w:hAnsi="Arial" w:cs="Arial"/>
+        </w:rPr>
+        <w:t>llm</w:t>
+      </w:r>
+      <w:proofErr w:type="spellEnd"/>
+      <w:r>
+        <w:rPr>
+          <w:rFonts w:ascii="Arial" w:hAnsi="Arial" w:cs="Arial"/>
+        </w:rPr>
+        <w:t xml:space="preserve">, </w:t>
+      </w:r>
+      <w:proofErr w:type="spellStart"/>
+      <w:r>
+        <w:rPr>
+          <w:rFonts w:ascii="Arial" w:hAnsi="Arial" w:cs="Arial"/>
+        </w:rPr>
+        <w:t>LangChain</w:t>
+      </w:r>
+      <w:proofErr w:type="spellEnd"/>
+    </w:p>
+    <w:p>
+      <w:pPr>
+        <w:pStyle w:val="ListParagraph"/>
+        <w:numPr>
+          <w:ilvl w:val="0"/>
+          <w:numId w:val="32"/>
+        </w:numPr>
+        <w:autoSpaceDE w:val="0"/>
+        <w:autoSpaceDN w:val="0"/>
+        <w:adjustRightInd w:val="0"/>
+        <w:rPr>
+          <w:rFonts w:ascii="Arial" w:hAnsi="Arial" w:cs="Arial"/>
+        </w:rPr>
+      </w:pPr>
+      <w:r>
+        <w:rPr>
+          <w:rFonts w:ascii="Arial" w:hAnsi="Arial" w:cs="Arial"/>
+        </w:rPr>
+        <w:t>Genomics: GATK, VEP</w:t>
+      </w:r>
+    </w:p>
+    <w:p>
+      <w:pPr>
+        <w:pStyle w:val="ListParagraph"/>
+        <w:numPr>
+          <w:ilvl w:val="0"/>
+          <w:numId w:val="32"/>
+        </w:numPr>
+        <w:autoSpaceDE w:val="0"/>
+        <w:autoSpaceDN w:val="0"/>
+        <w:adjustRightInd w:val="0"/>
+        <w:rPr>
+          <w:rFonts w:ascii="Arial" w:hAnsi="Arial" w:cs="Arial"/>
+        </w:rPr>
+      </w:pPr>
+      <w:r>
+        <w:rPr>
+          <w:rFonts w:ascii="Arial" w:hAnsi="Arial" w:cs="Arial"/>
+        </w:rPr>
+        <w:t>MS data</w:t>
+      </w:r>
+      <w:r>
+        <w:rPr>
+          <w:rFonts w:ascii="Arial" w:hAnsi="Arial" w:cs="Arial"/>
+        </w:rPr>
+        <w:t>:</w:t>
+      </w:r>
+      <w:r>
+        <w:rPr>
+          <w:rFonts w:ascii="Arial" w:hAnsi="Arial" w:cs="Arial"/>
         </w:rPr>
         <w:t xml:space="preserve"> </w:t>
       </w:r>
-      <w:r>
-        <w:rPr>
-          <w:rFonts w:ascii="Arial" w:hAnsi="Arial" w:cs="Arial"/>
-          <w:szCs w:val="24"/>
-        </w:rPr>
-        <w:t xml:space="preserve">I </w:t>
-      </w:r>
-      <w:r>
-        <w:rPr>
-          <w:rFonts w:ascii="Arial" w:hAnsi="Arial" w:cs="Arial"/>
-          <w:szCs w:val="24"/>
-        </w:rPr>
-        <w:t xml:space="preserve">seek integration </w:t>
-      </w:r>
-      <w:r>
-        <w:rPr>
-          <w:rFonts w:ascii="Arial" w:hAnsi="Arial" w:cs="Arial"/>
-          <w:szCs w:val="24"/>
-        </w:rPr>
-        <w:t xml:space="preserve">with </w:t>
-      </w:r>
-      <w:r>
-        <w:rPr>
-          <w:rFonts w:ascii="Arial" w:hAnsi="Arial" w:cs="Arial"/>
-          <w:szCs w:val="24"/>
-        </w:rPr>
-        <w:t>development</w:t>
-      </w:r>
-      <w:r>
-        <w:rPr>
-          <w:rFonts w:ascii="Arial" w:hAnsi="Arial" w:cs="Arial"/>
-          <w:szCs w:val="24"/>
-        </w:rPr>
-        <w:t>s</w:t>
-      </w:r>
-      <w:r>
-        <w:rPr>
-          <w:rFonts w:ascii="Arial" w:hAnsi="Arial" w:cs="Arial"/>
-          <w:szCs w:val="24"/>
-        </w:rPr>
-        <w:t xml:space="preserve"> in computational statistics, machine learning and artificial intelligence</w:t>
-      </w:r>
-      <w:r>
-        <w:rPr>
-          <w:rFonts w:ascii="Arial" w:hAnsi="Arial" w:cs="Arial"/>
-          <w:szCs w:val="24"/>
-        </w:rPr>
-        <w:t xml:space="preserve"> and </w:t>
-      </w:r>
-      <w:r>
-        <w:rPr>
-          <w:rFonts w:ascii="Arial" w:hAnsi="Arial" w:cs="Arial"/>
-          <w:szCs w:val="24"/>
-        </w:rPr>
-        <w:t xml:space="preserve">build </w:t>
-      </w:r>
-      <w:r>
-        <w:rPr>
-          <w:rFonts w:ascii="Arial" w:hAnsi="Arial" w:cs="Arial"/>
-          <w:szCs w:val="24"/>
-        </w:rPr>
-        <w:t xml:space="preserve">resources </w:t>
-      </w:r>
-      <w:r>
-        <w:rPr>
-          <w:rFonts w:ascii="Arial" w:hAnsi="Arial" w:cs="Arial"/>
-          <w:szCs w:val="24"/>
-        </w:rPr>
-        <w:t xml:space="preserve">and experiment </w:t>
-      </w:r>
-      <w:r>
-        <w:rPr>
-          <w:rFonts w:ascii="Arial" w:hAnsi="Arial" w:cs="Arial"/>
-          <w:szCs w:val="24"/>
-        </w:rPr>
-        <w:t xml:space="preserve">with </w:t>
-      </w:r>
-      <w:r>
-        <w:rPr>
-          <w:rFonts w:ascii="Arial" w:hAnsi="Arial" w:cs="Arial"/>
-          <w:szCs w:val="24"/>
-        </w:rPr>
-        <w:t xml:space="preserve">them </w:t>
-      </w:r>
-      <w:r>
-        <w:rPr>
-          <w:rFonts w:ascii="Arial" w:hAnsi="Arial" w:cs="Arial"/>
-          <w:szCs w:val="24"/>
-        </w:rPr>
-        <w:t xml:space="preserve">on </w:t>
-      </w:r>
-      <w:r>
-        <w:rPr>
-          <w:rFonts w:ascii="Arial" w:hAnsi="Arial" w:cs="Arial"/>
-          <w:szCs w:val="24"/>
-        </w:rPr>
-        <w:t xml:space="preserve">the University HPC, </w:t>
-      </w:r>
-      <w:r>
-        <w:rPr>
-          <w:rFonts w:ascii="Arial" w:hAnsi="Arial" w:cs="Arial"/>
-          <w:szCs w:val="24"/>
-        </w:rPr>
-        <w:t>https://cambridge-ceu.github.io/csd3/systems/ceuadmin.html</w:t>
-      </w:r>
-      <w:r>
-        <w:rPr>
-          <w:rFonts w:ascii="Arial" w:hAnsi="Arial" w:cs="Arial"/>
-          <w:szCs w:val="24"/>
-        </w:rPr>
-        <w:t>, wh</w:t>
-      </w:r>
-      <w:r>
-        <w:rPr>
-          <w:rFonts w:ascii="Arial" w:hAnsi="Arial" w:cs="Arial"/>
-          <w:szCs w:val="24"/>
-        </w:rPr>
-        <w:t xml:space="preserve">ich </w:t>
-      </w:r>
-      <w:r>
-        <w:rPr>
-          <w:rFonts w:ascii="Arial" w:hAnsi="Arial" w:cs="Arial"/>
-          <w:szCs w:val="24"/>
-        </w:rPr>
-        <w:t xml:space="preserve">include </w:t>
-      </w:r>
-      <w:r>
-        <w:rPr>
-          <w:rFonts w:ascii="Arial" w:hAnsi="Arial" w:cs="Arial"/>
-          <w:szCs w:val="24"/>
-        </w:rPr>
-        <w:t>AI</w:t>
-      </w:r>
-      <w:r>
-        <w:rPr>
-          <w:rFonts w:ascii="Arial" w:hAnsi="Arial" w:cs="Arial"/>
-          <w:szCs w:val="24"/>
+      <w:proofErr w:type="spellStart"/>
+      <w:r>
+        <w:rPr>
+          <w:rFonts w:ascii="Arial" w:hAnsi="Arial" w:cs="Arial"/>
+        </w:rPr>
+        <w:t>InstaNovo</w:t>
+      </w:r>
+      <w:proofErr w:type="spellEnd"/>
+      <w:r>
+        <w:rPr>
+          <w:rFonts w:ascii="Arial" w:hAnsi="Arial" w:cs="Arial"/>
+        </w:rPr>
+        <w:t>,</w:t>
+      </w:r>
+      <w:r>
+        <w:rPr>
+          <w:rFonts w:ascii="Arial" w:hAnsi="Arial" w:cs="Arial"/>
+        </w:rPr>
+        <w:t xml:space="preserve"> DIA-NN</w:t>
+      </w:r>
+      <w:r>
+        <w:rPr>
+          <w:rFonts w:ascii="Arial" w:hAnsi="Arial" w:cs="Arial"/>
+        </w:rPr>
+        <w:t xml:space="preserve">, </w:t>
+      </w:r>
+      <w:proofErr w:type="spellStart"/>
+      <w:r>
+        <w:rPr>
+          <w:rFonts w:ascii="Arial" w:hAnsi="Arial" w:cs="Arial"/>
+        </w:rPr>
+        <w:t>OpenMS</w:t>
+      </w:r>
+      <w:proofErr w:type="spellEnd"/>
+    </w:p>
+    <w:p>
+      <w:pPr>
+        <w:pStyle w:val="ListParagraph"/>
+        <w:numPr>
+          <w:ilvl w:val="0"/>
+          <w:numId w:val="32"/>
+        </w:numPr>
+        <w:autoSpaceDE w:val="0"/>
+        <w:autoSpaceDN w:val="0"/>
+        <w:adjustRightInd w:val="0"/>
+        <w:rPr>
+          <w:rFonts w:ascii="Arial" w:hAnsi="Arial" w:cs="Arial"/>
+        </w:rPr>
+      </w:pPr>
+      <w:r>
+        <w:rPr>
+          <w:rFonts w:ascii="Arial" w:hAnsi="Arial" w:cs="Arial"/>
+        </w:rPr>
+        <w:t>S</w:t>
+      </w:r>
+      <w:r>
+        <w:rPr>
+          <w:rFonts w:ascii="Arial" w:hAnsi="Arial" w:cs="Arial"/>
+        </w:rPr>
+        <w:t>ingle-cell omics</w:t>
+      </w:r>
+      <w:r>
+        <w:rPr>
+          <w:rFonts w:ascii="Arial" w:hAnsi="Arial" w:cs="Arial"/>
+        </w:rPr>
+        <w:t>:</w:t>
+      </w:r>
+      <w:r>
+        <w:rPr>
+          <w:rFonts w:ascii="Arial" w:hAnsi="Arial" w:cs="Arial"/>
+        </w:rPr>
+        <w:t xml:space="preserve"> Seurat, </w:t>
+      </w:r>
+      <w:proofErr w:type="spellStart"/>
+      <w:r>
+        <w:rPr>
+          <w:rFonts w:ascii="Arial" w:hAnsi="Arial" w:cs="Arial"/>
+        </w:rPr>
+        <w:t>scp</w:t>
+      </w:r>
+      <w:proofErr w:type="spellEnd"/>
+      <w:r>
+        <w:rPr>
+          <w:rFonts w:ascii="Arial" w:hAnsi="Arial" w:cs="Arial"/>
+        </w:rPr>
+        <w:t xml:space="preserve">, </w:t>
+      </w:r>
+      <w:proofErr w:type="spellStart"/>
+      <w:r>
+        <w:rPr>
+          <w:rFonts w:ascii="Arial" w:hAnsi="Arial" w:cs="Arial"/>
+        </w:rPr>
+        <w:t>scanpy</w:t>
+      </w:r>
+      <w:proofErr w:type="spellEnd"/>
+      <w:r>
+        <w:rPr>
+          <w:rFonts w:ascii="Arial" w:hAnsi="Arial" w:cs="Arial"/>
+        </w:rPr>
+        <w:t xml:space="preserve">, </w:t>
+      </w:r>
+      <w:proofErr w:type="spellStart"/>
+      <w:r>
+        <w:rPr>
+          <w:rFonts w:ascii="Arial" w:hAnsi="Arial" w:cs="Arial"/>
+        </w:rPr>
+        <w:t>scvi</w:t>
+      </w:r>
+      <w:proofErr w:type="spellEnd"/>
+      <w:r>
+        <w:rPr>
+          <w:rFonts w:ascii="Arial" w:hAnsi="Arial" w:cs="Arial"/>
+        </w:rPr>
+        <w:t xml:space="preserve">-tools, </w:t>
+      </w:r>
+      <w:proofErr w:type="spellStart"/>
+      <w:r>
+        <w:rPr>
+          <w:rFonts w:ascii="Arial" w:hAnsi="Arial" w:cs="Arial"/>
+        </w:rPr>
+        <w:t>scGPT</w:t>
+      </w:r>
+      <w:proofErr w:type="spellEnd"/>
+      <w:r>
+        <w:rPr>
+          <w:rFonts w:ascii="Arial" w:hAnsi="Arial" w:cs="Arial"/>
+        </w:rPr>
+        <w:t>,</w:t>
+      </w:r>
+      <w:r>
+        <w:rPr>
+          <w:rFonts w:ascii="Arial" w:hAnsi="Arial" w:cs="Arial"/>
+        </w:rPr>
+        <w:t xml:space="preserve"> C2S-Scale</w:t>
+      </w:r>
+    </w:p>
+    <w:p>
+      <w:pPr>
+        <w:pStyle w:val="ListParagraph"/>
+        <w:numPr>
+          <w:ilvl w:val="0"/>
+          <w:numId w:val="32"/>
+        </w:numPr>
+        <w:autoSpaceDE w:val="0"/>
+        <w:autoSpaceDN w:val="0"/>
+        <w:adjustRightInd w:val="0"/>
+        <w:rPr>
+          <w:rFonts w:ascii="Arial" w:hAnsi="Arial" w:cs="Arial"/>
+        </w:rPr>
+      </w:pPr>
+      <w:r>
+        <w:rPr>
+          <w:rFonts w:ascii="Arial" w:hAnsi="Arial" w:cs="Arial"/>
+        </w:rPr>
+        <w:t>mtDNA analysis</w:t>
+      </w:r>
+      <w:r>
+        <w:rPr>
+          <w:rFonts w:ascii="Arial" w:hAnsi="Arial" w:cs="Arial"/>
+        </w:rPr>
+        <w:t>:</w:t>
+      </w:r>
+      <w:r>
+        <w:rPr>
+          <w:rFonts w:ascii="Arial" w:hAnsi="Arial" w:cs="Arial"/>
         </w:rPr>
         <w:t xml:space="preserve"> </w:t>
       </w:r>
-      <w:r>
-        <w:rPr>
-          <w:rFonts w:ascii="Arial" w:hAnsi="Arial" w:cs="Arial"/>
-          <w:szCs w:val="24"/>
-        </w:rPr>
-        <w:t xml:space="preserve">with </w:t>
-      </w:r>
       <w:proofErr w:type="spellStart"/>
       <w:r>
         <w:rPr>
           <w:rFonts w:ascii="Arial" w:hAnsi="Arial" w:cs="Arial"/>
-          <w:szCs w:val="24"/>
-        </w:rPr>
-        <w:t>BitNet</w:t>
+        </w:rPr>
+        <w:t>MToolBox</w:t>
       </w:r>
       <w:proofErr w:type="spellEnd"/>
       <w:r>
         <w:rPr>
           <w:rFonts w:ascii="Arial" w:hAnsi="Arial" w:cs="Arial"/>
-          <w:szCs w:val="24"/>
         </w:rPr>
         <w:t xml:space="preserve">, </w:t>
       </w:r>
-      <w:r>
-        <w:rPr>
-          <w:rFonts w:ascii="Arial" w:hAnsi="Arial" w:cs="Arial"/>
-          <w:szCs w:val="24"/>
-        </w:rPr>
-        <w:t>Claude Code,</w:t>
-      </w:r>
-      <w:r>
-        <w:rPr>
-          <w:rFonts w:ascii="Arial" w:hAnsi="Arial" w:cs="Arial"/>
-          <w:szCs w:val="24"/>
+      <w:proofErr w:type="spellStart"/>
+      <w:r>
+        <w:rPr>
+          <w:rFonts w:ascii="Arial" w:hAnsi="Arial" w:cs="Arial"/>
+        </w:rPr>
+        <w:t>fNUMT</w:t>
+      </w:r>
+      <w:proofErr w:type="spellEnd"/>
+      <w:r>
+        <w:rPr>
+          <w:rFonts w:ascii="Arial" w:hAnsi="Arial" w:cs="Arial"/>
+        </w:rPr>
+        <w:t xml:space="preserve">, </w:t>
+      </w:r>
+      <w:proofErr w:type="spellStart"/>
+      <w:r>
+        <w:rPr>
+          <w:rFonts w:ascii="Arial" w:hAnsi="Arial" w:cs="Arial"/>
+        </w:rPr>
+        <w:t>haplogrep</w:t>
+      </w:r>
+      <w:proofErr w:type="spellEnd"/>
+      <w:r>
+        <w:rPr>
+          <w:rFonts w:ascii="Arial" w:hAnsi="Arial" w:cs="Arial"/>
+        </w:rPr>
+        <w:t>;</w:t>
+      </w:r>
+      <w:r>
+        <w:rPr>
+          <w:rFonts w:ascii="Arial" w:hAnsi="Arial" w:cs="Arial"/>
         </w:rPr>
         <w:t xml:space="preserve"> </w:t>
       </w:r>
+      <w:r>
+        <w:rPr>
+          <w:rFonts w:ascii="Arial" w:hAnsi="Arial" w:cs="Arial"/>
+        </w:rPr>
+        <w:t xml:space="preserve">long-read sequencing </w:t>
+      </w:r>
+      <w:r>
+        <w:rPr>
+          <w:rFonts w:ascii="Arial" w:hAnsi="Arial" w:cs="Arial"/>
+        </w:rPr>
+        <w:t>analysis</w:t>
+      </w:r>
+      <w:r>
+        <w:rPr>
+          <w:rFonts w:ascii="Arial" w:hAnsi="Arial" w:cs="Arial"/>
+        </w:rPr>
+        <w:t>:</w:t>
+      </w:r>
+      <w:r>
+        <w:rPr>
+          <w:rFonts w:ascii="Arial" w:hAnsi="Arial" w:cs="Arial"/>
+        </w:rPr>
+        <w:t xml:space="preserve"> </w:t>
+      </w:r>
       <w:proofErr w:type="spellStart"/>
       <w:r>
         <w:rPr>
           <w:rFonts w:ascii="Arial" w:hAnsi="Arial" w:cs="Arial"/>
-          <w:szCs w:val="24"/>
-        </w:rPr>
-        <w:t>Ollama</w:t>
+        </w:rPr>
+        <w:t>SVanalyzer</w:t>
       </w:r>
       <w:proofErr w:type="spellEnd"/>
       <w:r>
         <w:rPr>
           <w:rFonts w:ascii="Arial" w:hAnsi="Arial" w:cs="Arial"/>
-          <w:szCs w:val="24"/>
         </w:rPr>
         <w:t xml:space="preserve">, </w:t>
       </w:r>
+      <w:r>
+        <w:rPr>
+          <w:rFonts w:ascii="Arial" w:hAnsi="Arial" w:cs="Arial"/>
+        </w:rPr>
+        <w:t>hap.py, sniffles,</w:t>
+      </w:r>
+      <w:r>
+        <w:rPr>
+          <w:rFonts w:ascii="Arial" w:hAnsi="Arial" w:cs="Arial"/>
+        </w:rPr>
+        <w:t xml:space="preserve"> </w:t>
+      </w:r>
       <w:proofErr w:type="spellStart"/>
       <w:r>
         <w:rPr>
           <w:rFonts w:ascii="Arial" w:hAnsi="Arial" w:cs="Arial"/>
-          <w:szCs w:val="24"/>
-        </w:rPr>
-        <w:t>OpenClaw</w:t>
+        </w:rPr>
+        <w:t>truvari</w:t>
       </w:r>
       <w:proofErr w:type="spellEnd"/>
-      <w:r>
-        <w:rPr>
-          <w:rFonts w:ascii="Arial" w:hAnsi="Arial" w:cs="Arial"/>
-          <w:szCs w:val="24"/>
+    </w:p>
+    <w:p>
+      <w:pPr>
+        <w:pStyle w:val="ListParagraph"/>
+        <w:numPr>
+          <w:ilvl w:val="0"/>
+          <w:numId w:val="32"/>
+        </w:numPr>
+        <w:autoSpaceDE w:val="0"/>
+        <w:autoSpaceDN w:val="0"/>
+        <w:adjustRightInd w:val="0"/>
+        <w:rPr>
+          <w:rFonts w:ascii="Arial" w:hAnsi="Arial" w:cs="Arial"/>
+        </w:rPr>
+      </w:pPr>
+      <w:r>
+        <w:rPr>
+          <w:rFonts w:ascii="Arial" w:hAnsi="Arial" w:cs="Arial"/>
+        </w:rPr>
+        <w:t>P</w:t>
+      </w:r>
+      <w:r>
+        <w:rPr>
+          <w:rFonts w:ascii="Arial" w:hAnsi="Arial" w:cs="Arial"/>
+        </w:rPr>
+        <w:t>opulation genetics</w:t>
+      </w:r>
+      <w:r>
+        <w:rPr>
+          <w:rFonts w:ascii="Arial" w:hAnsi="Arial" w:cs="Arial"/>
+        </w:rPr>
+        <w:t>:</w:t>
+      </w:r>
+      <w:r>
+        <w:rPr>
+          <w:rFonts w:ascii="Arial" w:hAnsi="Arial" w:cs="Arial"/>
+        </w:rPr>
+        <w:t xml:space="preserve"> </w:t>
+      </w:r>
+      <w:proofErr w:type="spellStart"/>
+      <w:r>
+        <w:rPr>
+          <w:rFonts w:ascii="Arial" w:hAnsi="Arial" w:cs="Arial"/>
+        </w:rPr>
+        <w:t>selscan</w:t>
+      </w:r>
+      <w:proofErr w:type="spellEnd"/>
+      <w:r>
+        <w:rPr>
+          <w:rFonts w:ascii="Arial" w:hAnsi="Arial" w:cs="Arial"/>
         </w:rPr>
         <w:t xml:space="preserve">, </w:t>
       </w:r>
-      <w:r>
-        <w:rPr>
-          <w:rFonts w:ascii="Arial" w:hAnsi="Arial" w:cs="Arial"/>
-          <w:szCs w:val="24"/>
-        </w:rPr>
-        <w:t xml:space="preserve">codex-cli, copilot-cli, </w:t>
-      </w:r>
       <w:proofErr w:type="spellStart"/>
       <w:r>
         <w:rPr>
           <w:rFonts w:ascii="Arial" w:hAnsi="Arial" w:cs="Arial"/>
-          <w:szCs w:val="24"/>
-        </w:rPr>
-        <w:t>gemini</w:t>
+        </w:rPr>
+        <w:t>angsd</w:t>
       </w:r>
       <w:proofErr w:type="spellEnd"/>
       <w:r>
         <w:rPr>
           <w:rFonts w:ascii="Arial" w:hAnsi="Arial" w:cs="Arial"/>
-          <w:szCs w:val="24"/>
-        </w:rPr>
-        <w:t xml:space="preserve">-cli, </w:t>
-      </w:r>
-      <w:proofErr w:type="spellStart"/>
-      <w:r>
-        <w:rPr>
-          <w:rFonts w:ascii="Arial" w:hAnsi="Arial" w:cs="Arial"/>
-          <w:szCs w:val="24"/>
-        </w:rPr>
-        <w:t>hermes</w:t>
-      </w:r>
-      <w:proofErr w:type="spellEnd"/>
-      <w:r>
-        <w:rPr>
-          <w:rFonts w:ascii="Arial" w:hAnsi="Arial" w:cs="Arial"/>
-          <w:szCs w:val="24"/>
-        </w:rPr>
-        <w:t xml:space="preserve">-agent, </w:t>
-      </w:r>
-      <w:r>
-        <w:rPr>
-          <w:rFonts w:ascii="Arial" w:hAnsi="Arial" w:cs="Arial"/>
-          <w:szCs w:val="24"/>
-        </w:rPr>
-        <w:t xml:space="preserve">llama.cpp, </w:t>
-      </w:r>
-      <w:r>
-        <w:rPr>
-          <w:rFonts w:ascii="Arial" w:hAnsi="Arial" w:cs="Arial"/>
-        </w:rPr>
-        <w:t xml:space="preserve">They also involve models, platforms and libraries such as TensorFlow, </w:t>
-      </w:r>
-      <w:proofErr w:type="spellStart"/>
-      <w:r>
-        <w:rPr>
-          <w:rFonts w:ascii="Arial" w:hAnsi="Arial" w:cs="Arial"/>
-        </w:rPr>
-        <w:t>PyTorch</w:t>
-      </w:r>
-      <w:proofErr w:type="spellEnd"/>
-      <w:r>
-        <w:rPr>
-          <w:rFonts w:ascii="Arial" w:hAnsi="Arial" w:cs="Arial"/>
-        </w:rPr>
-        <w:t>, scikit-</w:t>
-      </w:r>
-      <w:proofErr w:type="spellStart"/>
-      <w:r>
-        <w:rPr>
-          <w:rFonts w:ascii="Arial" w:hAnsi="Arial" w:cs="Arial"/>
-        </w:rPr>
-        <w:t>llm</w:t>
-      </w:r>
-      <w:proofErr w:type="spellEnd"/>
-      <w:r>
-        <w:rPr>
-          <w:rFonts w:ascii="Arial" w:hAnsi="Arial" w:cs="Arial"/>
-        </w:rPr>
-        <w:t xml:space="preserve">, </w:t>
-      </w:r>
-      <w:proofErr w:type="spellStart"/>
-      <w:r>
-        <w:rPr>
-          <w:rFonts w:ascii="Arial" w:hAnsi="Arial" w:cs="Arial"/>
-        </w:rPr>
-        <w:t>LangChain</w:t>
-      </w:r>
-      <w:proofErr w:type="spellEnd"/>
-      <w:r>
-        <w:rPr>
-          <w:rFonts w:ascii="Arial" w:hAnsi="Arial" w:cs="Arial"/>
-        </w:rPr>
-        <w:t xml:space="preserve">. </w:t>
-      </w:r>
-      <w:r>
-        <w:rPr>
-          <w:rFonts w:ascii="Arial" w:hAnsi="Arial" w:cs="Arial"/>
-        </w:rPr>
-        <w:t>featur</w:t>
-      </w:r>
-      <w:r>
-        <w:rPr>
-          <w:rFonts w:ascii="Arial" w:hAnsi="Arial" w:cs="Arial"/>
-        </w:rPr>
-        <w:t xml:space="preserve">ing </w:t>
-      </w:r>
-      <w:r>
-        <w:rPr>
-          <w:rFonts w:ascii="Arial" w:hAnsi="Arial" w:cs="Arial"/>
-        </w:rPr>
-        <w:t xml:space="preserve">popular publications and </w:t>
-      </w:r>
-      <w:r>
-        <w:rPr>
-          <w:rFonts w:ascii="Arial" w:hAnsi="Arial" w:cs="Arial"/>
-        </w:rPr>
-        <w:t xml:space="preserve">AI for MS data with </w:t>
-      </w:r>
-      <w:proofErr w:type="spellStart"/>
-      <w:r>
-        <w:rPr>
-          <w:rFonts w:ascii="Arial" w:hAnsi="Arial" w:cs="Arial"/>
-        </w:rPr>
-        <w:t>InstaNovo</w:t>
-      </w:r>
-      <w:proofErr w:type="spellEnd"/>
-      <w:r>
-        <w:rPr>
-          <w:rFonts w:ascii="Arial" w:hAnsi="Arial" w:cs="Arial"/>
-        </w:rPr>
-        <w:t xml:space="preserve"> &amp; DIA-NN, single-cell omics with Seurat, </w:t>
-      </w:r>
-      <w:proofErr w:type="spellStart"/>
-      <w:r>
-        <w:rPr>
-          <w:rFonts w:ascii="Arial" w:hAnsi="Arial" w:cs="Arial"/>
-        </w:rPr>
-        <w:t>scp</w:t>
-      </w:r>
-      <w:proofErr w:type="spellEnd"/>
-      <w:r>
-        <w:rPr>
-          <w:rFonts w:ascii="Arial" w:hAnsi="Arial" w:cs="Arial"/>
-        </w:rPr>
-        <w:t xml:space="preserve">, </w:t>
-      </w:r>
-      <w:proofErr w:type="spellStart"/>
-      <w:r>
-        <w:rPr>
-          <w:rFonts w:ascii="Arial" w:hAnsi="Arial" w:cs="Arial"/>
-        </w:rPr>
-        <w:t>scanpy</w:t>
-      </w:r>
-      <w:proofErr w:type="spellEnd"/>
-      <w:r>
-        <w:rPr>
-          <w:rFonts w:ascii="Arial" w:hAnsi="Arial" w:cs="Arial"/>
-        </w:rPr>
-        <w:t xml:space="preserve">, </w:t>
-      </w:r>
-      <w:proofErr w:type="spellStart"/>
-      <w:r>
-        <w:rPr>
-          <w:rFonts w:ascii="Arial" w:hAnsi="Arial" w:cs="Arial"/>
-        </w:rPr>
-        <w:t>scvi</w:t>
-      </w:r>
-      <w:proofErr w:type="spellEnd"/>
-      <w:r>
-        <w:rPr>
-          <w:rFonts w:ascii="Arial" w:hAnsi="Arial" w:cs="Arial"/>
-        </w:rPr>
-        <w:t xml:space="preserve">-tools, </w:t>
-      </w:r>
-      <w:proofErr w:type="spellStart"/>
-      <w:r>
-        <w:rPr>
-          <w:rFonts w:ascii="Arial" w:hAnsi="Arial" w:cs="Arial"/>
-        </w:rPr>
-        <w:t>scGPT</w:t>
-      </w:r>
-      <w:proofErr w:type="spellEnd"/>
-      <w:r>
-        <w:rPr>
-          <w:rFonts w:ascii="Arial" w:hAnsi="Arial" w:cs="Arial"/>
-        </w:rPr>
-        <w:t>,</w:t>
-      </w:r>
-      <w:r>
-        <w:rPr>
-          <w:rFonts w:ascii="Arial" w:hAnsi="Arial" w:cs="Arial"/>
-        </w:rPr>
-        <w:t xml:space="preserve"> C2S-Scale</w:t>
-      </w:r>
-      <w:r>
-        <w:rPr>
-          <w:rFonts w:ascii="Arial" w:hAnsi="Arial" w:cs="Arial"/>
-        </w:rPr>
-        <w:t xml:space="preserve">, </w:t>
-      </w:r>
-      <w:r>
-        <w:rPr>
-          <w:rFonts w:ascii="Arial" w:hAnsi="Arial" w:cs="Arial"/>
-        </w:rPr>
-        <w:t xml:space="preserve">mtDNA analysis with </w:t>
-      </w:r>
-      <w:proofErr w:type="spellStart"/>
-      <w:r>
-        <w:rPr>
-          <w:rFonts w:ascii="Arial" w:hAnsi="Arial" w:cs="Arial"/>
-        </w:rPr>
-        <w:t>MToolBox</w:t>
-      </w:r>
-      <w:proofErr w:type="spellEnd"/>
-      <w:r>
-        <w:rPr>
-          <w:rFonts w:ascii="Arial" w:hAnsi="Arial" w:cs="Arial"/>
-        </w:rPr>
-        <w:t xml:space="preserve">, </w:t>
-      </w:r>
-      <w:proofErr w:type="spellStart"/>
-      <w:r>
-        <w:rPr>
-          <w:rFonts w:ascii="Arial" w:hAnsi="Arial" w:cs="Arial"/>
-        </w:rPr>
-        <w:t>fNUMT</w:t>
-      </w:r>
-      <w:proofErr w:type="spellEnd"/>
-      <w:r>
-        <w:rPr>
-          <w:rFonts w:ascii="Arial" w:hAnsi="Arial" w:cs="Arial"/>
-        </w:rPr>
-        <w:t xml:space="preserve">, </w:t>
-      </w:r>
-      <w:proofErr w:type="spellStart"/>
-      <w:r>
-        <w:rPr>
-          <w:rFonts w:ascii="Arial" w:hAnsi="Arial" w:cs="Arial"/>
-        </w:rPr>
-        <w:t>haplogrep</w:t>
-      </w:r>
-      <w:proofErr w:type="spellEnd"/>
-      <w:r>
-        <w:rPr>
-          <w:rFonts w:ascii="Arial" w:hAnsi="Arial" w:cs="Arial"/>
-        </w:rPr>
-        <w:t xml:space="preserve"> </w:t>
-      </w:r>
-      <w:r>
-        <w:rPr>
-          <w:rFonts w:ascii="Arial" w:hAnsi="Arial" w:cs="Arial"/>
-        </w:rPr>
-        <w:t>a</w:t>
-      </w:r>
-      <w:r>
-        <w:rPr>
-          <w:rFonts w:ascii="Arial" w:hAnsi="Arial" w:cs="Arial"/>
-        </w:rPr>
-        <w:t xml:space="preserve">s well as </w:t>
-      </w:r>
-      <w:r>
-        <w:rPr>
-          <w:rFonts w:ascii="Arial" w:hAnsi="Arial" w:cs="Arial"/>
-        </w:rPr>
-        <w:t xml:space="preserve">long-read sequencing </w:t>
-      </w:r>
-      <w:r>
-        <w:rPr>
-          <w:rFonts w:ascii="Arial" w:hAnsi="Arial" w:cs="Arial"/>
-        </w:rPr>
-        <w:t xml:space="preserve">analysis </w:t>
-      </w:r>
-      <w:r>
-        <w:rPr>
-          <w:rFonts w:ascii="Arial" w:hAnsi="Arial" w:cs="Arial"/>
-        </w:rPr>
-        <w:t xml:space="preserve">with </w:t>
-      </w:r>
-      <w:proofErr w:type="spellStart"/>
-      <w:r>
-        <w:rPr>
-          <w:rFonts w:ascii="Arial" w:hAnsi="Arial" w:cs="Arial"/>
-        </w:rPr>
-        <w:t>SVanalyzer</w:t>
-      </w:r>
-      <w:proofErr w:type="spellEnd"/>
-      <w:r>
-        <w:rPr>
-          <w:rFonts w:ascii="Arial" w:hAnsi="Arial" w:cs="Arial"/>
-        </w:rPr>
-        <w:t xml:space="preserve">, </w:t>
-      </w:r>
-      <w:r>
-        <w:rPr>
-          <w:rFonts w:ascii="Arial" w:hAnsi="Arial" w:cs="Arial"/>
-        </w:rPr>
-        <w:t>hap.py, sniffles,</w:t>
-      </w:r>
-      <w:r>
-        <w:rPr>
-          <w:rFonts w:ascii="Arial" w:hAnsi="Arial" w:cs="Arial"/>
-        </w:rPr>
-        <w:t xml:space="preserve"> </w:t>
-      </w:r>
-      <w:proofErr w:type="spellStart"/>
-      <w:r>
-        <w:rPr>
-          <w:rFonts w:ascii="Arial" w:hAnsi="Arial" w:cs="Arial"/>
-        </w:rPr>
-        <w:t>truvari</w:t>
-      </w:r>
-      <w:proofErr w:type="spellEnd"/>
-      <w:r>
-        <w:rPr>
-          <w:rFonts w:ascii="Arial" w:hAnsi="Arial" w:cs="Arial"/>
-        </w:rPr>
-        <w:t>.</w:t>
-      </w:r>
-      <w:r>
-        <w:rPr>
-          <w:rFonts w:ascii="Arial" w:hAnsi="Arial" w:cs="Arial"/>
-        </w:rPr>
-        <w:t xml:space="preserve"> </w:t>
-      </w:r>
-      <w:r>
-        <w:rPr>
-          <w:rFonts w:ascii="Arial" w:hAnsi="Arial" w:cs="Arial"/>
-        </w:rPr>
-        <w:t>Exploration</w:t>
-      </w:r>
-      <w:r>
-        <w:rPr>
-          <w:rFonts w:ascii="Arial" w:hAnsi="Arial" w:cs="Arial"/>
-        </w:rPr>
-        <w:t>s</w:t>
-      </w:r>
-      <w:r>
-        <w:rPr>
-          <w:rFonts w:ascii="Arial" w:hAnsi="Arial" w:cs="Arial"/>
-        </w:rPr>
-        <w:t xml:space="preserve"> in p</w:t>
-      </w:r>
-      <w:r>
-        <w:rPr>
-          <w:rFonts w:ascii="Arial" w:hAnsi="Arial" w:cs="Arial"/>
-        </w:rPr>
-        <w:t xml:space="preserve">opulation genetics include </w:t>
-      </w:r>
-      <w:proofErr w:type="spellStart"/>
-      <w:r>
-        <w:rPr>
-          <w:rFonts w:ascii="Arial" w:hAnsi="Arial" w:cs="Arial"/>
-        </w:rPr>
-        <w:t>selscan</w:t>
-      </w:r>
-      <w:proofErr w:type="spellEnd"/>
-      <w:r>
-        <w:rPr>
-          <w:rFonts w:ascii="Arial" w:hAnsi="Arial" w:cs="Arial"/>
-        </w:rPr>
-        <w:t xml:space="preserve">, </w:t>
-      </w:r>
-      <w:proofErr w:type="spellStart"/>
-      <w:r>
-        <w:rPr>
-          <w:rFonts w:ascii="Arial" w:hAnsi="Arial" w:cs="Arial"/>
-        </w:rPr>
-        <w:t>angsd</w:t>
-      </w:r>
-      <w:proofErr w:type="spellEnd"/>
-      <w:r>
-        <w:rPr>
-          <w:rFonts w:ascii="Arial" w:hAnsi="Arial" w:cs="Arial"/>
-        </w:rPr>
-        <w:t>, relate, clues2 and fastsimcoal2.</w:t>
+        </w:rPr>
+        <w:t>, relate, clues2 and fastsimcoal2</w:t>
       </w:r>
     </w:p>
     <w:p>
@@ -1563,7 +1610,7 @@
       <w:pPr>
         <w:rPr>
           <w:rFonts w:ascii="Arial" w:hAnsi="Arial" w:cs="Arial"/>
-          <w:bCs/>
+          <w:b/>
           <w:szCs w:val="24"/>
         </w:rPr>
       </w:pPr>
@@ -1586,6 +1633,11 @@
     </w:p>
     <w:p>
       <w:pPr>
+        <w:pStyle w:val="ListParagraph"/>
+        <w:numPr>
+          <w:ilvl w:val="0"/>
+          <w:numId w:val="34"/>
+        </w:numPr>
         <w:rPr>
           <w:rFonts w:ascii="Arial" w:hAnsi="Arial" w:cs="Arial"/>
           <w:b/>
@@ -1593,9 +1645,85 @@
           <w:lang w:val="fr-FR"/>
         </w:rPr>
       </w:pPr>
+      <w:proofErr w:type="spellStart"/>
+      <w:r>
+        <w:rPr>
+          <w:rFonts w:ascii="Arial" w:hAnsi="Arial" w:cs="Arial"/>
+          <w:szCs w:val="24"/>
+        </w:rPr>
+        <w:t>Koprulu</w:t>
+      </w:r>
+      <w:proofErr w:type="spellEnd"/>
+      <w:r>
+        <w:rPr>
+          <w:rFonts w:ascii="Arial" w:hAnsi="Arial" w:cs="Arial"/>
+          <w:szCs w:val="24"/>
+        </w:rPr>
+        <w:t xml:space="preserve"> M, et al. </w:t>
+      </w:r>
+      <w:r>
+        <w:rPr>
+          <w:rFonts w:ascii="Arial" w:hAnsi="Arial" w:cs="Arial"/>
+          <w:szCs w:val="24"/>
+          <w:lang w:val="en-GB"/>
+        </w:rPr>
+        <w:t xml:space="preserve">Multi-cohort proteogenomic analyses reveal genetic effects across the proteome and </w:t>
+      </w:r>
+      <w:proofErr w:type="spellStart"/>
+      <w:r>
+        <w:rPr>
+          <w:rFonts w:ascii="Arial" w:hAnsi="Arial" w:cs="Arial"/>
+          <w:szCs w:val="24"/>
+          <w:lang w:val="en-GB"/>
+        </w:rPr>
+        <w:t>diseasome</w:t>
+      </w:r>
+      <w:proofErr w:type="spellEnd"/>
+      <w:r>
+        <w:rPr>
+          <w:rFonts w:ascii="Arial" w:hAnsi="Arial" w:cs="Arial"/>
+          <w:szCs w:val="24"/>
+        </w:rPr>
+        <w:t>.</w:t>
+      </w:r>
+      <w:r>
+        <w:rPr>
+          <w:rFonts w:ascii="Arial" w:hAnsi="Arial" w:cs="Arial"/>
+        </w:rPr>
+        <w:t xml:space="preserve"> </w:t>
+      </w:r>
+      <w:r>
+        <w:rPr>
+          <w:rFonts w:ascii="Arial" w:hAnsi="Arial" w:cs="Arial"/>
+          <w:i/>
+          <w:iCs/>
+        </w:rPr>
+        <w:t xml:space="preserve">Cell </w:t>
+      </w:r>
+      <w:r>
+        <w:rPr>
+          <w:rFonts w:ascii="Arial" w:hAnsi="Arial" w:cs="Arial"/>
+        </w:rPr>
+        <w:t xml:space="preserve">(2026). </w:t>
+      </w:r>
+      <w:r>
+        <w:rPr>
+          <w:rFonts w:ascii="Arial" w:hAnsi="Arial" w:cs="Arial"/>
+          <w:szCs w:val="24"/>
+        </w:rPr>
+        <w:t>DOI: 10.1016/j.cell.2026.03.049.</w:t>
+      </w:r>
     </w:p>
     <w:p>
       <w:pPr>
+        <w:pStyle w:val="ListParagraph"/>
+        <w:numPr>
+          <w:ilvl w:val="0"/>
+          <w:numId w:val="34"/>
+        </w:numPr>
+        <w:tabs>
+          <w:tab w:val="left" w:pos="-720"/>
+        </w:tabs>
         <w:jc w:val="both"/>
         <w:rPr>
           <w:rFonts w:ascii="Arial" w:hAnsi="Arial" w:cs="Arial"/>
@@ -1692,17 +1820,14 @@
     </w:p>
     <w:p>
       <w:pPr>
+        <w:pStyle w:val="ListParagraph"/>
+        <w:numPr>
+          <w:ilvl w:val="0"/>
+          <w:numId w:val="34"/>
+        </w:numPr>
         <w:tabs>
           <w:tab w:val="left" w:pos="-720"/>
         </w:tabs>
-        <w:rPr>
-          <w:rFonts w:ascii="Arial" w:hAnsi="Arial" w:cs="Arial"/>
-          <w:szCs w:val="24"/>
-        </w:rPr>
-      </w:pPr>
-    </w:p>
-    <w:p>
-      <w:pPr>
         <w:autoSpaceDE w:val="0"/>
         <w:autoSpaceDN w:val="0"/>
         <w:adjustRightInd w:val="0"/>
@@ -1710,6 +1835,7 @@
         <w:rPr>
           <w:rFonts w:ascii="Arial" w:hAnsi="Arial" w:cs="Arial"/>
           <w:szCs w:val="24"/>
+          <w:lang w:val="fr-FR"/>
         </w:rPr>
       </w:pPr>
       <w:r>
@@ -1860,23 +1986,7 @@
           <w:szCs w:val="24"/>
           <w:lang w:val="en-GB" w:eastAsia="zh-CN"/>
         </w:rPr>
-        <w:t>The</w:t>
-      </w:r>
-      <w:r>
-        <w:rPr>
-          <w:rFonts w:ascii="Arial" w:hAnsi="Arial" w:cs="Arial"/>
-          <w:szCs w:val="24"/>
-          <w:lang w:val="en-GB" w:eastAsia="zh-CN"/>
-        </w:rPr>
-        <w:t xml:space="preserve"> Host Genetics Initiative</w:t>
-      </w:r>
-      <w:r>
-        <w:rPr>
-          <w:rFonts w:ascii="Arial" w:hAnsi="Arial" w:cs="Arial"/>
-          <w:szCs w:val="24"/>
-          <w:lang w:val="en-GB" w:eastAsia="zh-CN"/>
-        </w:rPr>
-        <w:t xml:space="preserve">. A second update on mapping the human genetic architecture of COVID-19. </w:t>
+        <w:t xml:space="preserve">The Host Genetics Initiative. A second update on mapping the human genetic architecture of COVID-19. </w:t>
       </w:r>
       <w:r>
         <w:rPr>
@@ -1933,18 +2043,14 @@
     </w:p>
     <w:p>
       <w:pPr>
+        <w:pStyle w:val="ListParagraph"/>
+        <w:numPr>
+          <w:ilvl w:val="0"/>
+          <w:numId w:val="34"/>
+        </w:numPr>
         <w:tabs>
           <w:tab w:val="left" w:pos="-720"/>
         </w:tabs>
-        <w:rPr>
-          <w:rFonts w:ascii="Arial" w:hAnsi="Arial" w:cs="Arial"/>
-          <w:szCs w:val="24"/>
-          <w:lang w:val="fr-FR"/>
-        </w:rPr>
-      </w:pPr>
-    </w:p>
-    <w:p>
-      <w:pPr>
         <w:autoSpaceDE w:val="0"/>
         <w:autoSpaceDN w:val="0"/>
         <w:adjustRightInd w:val="0"/>
@@ -2058,21 +2164,117 @@
         </w:rPr>
         <w:t>: 10.18637/jss.v085.i06</w:t>
       </w:r>
+      <w:r>
+        <w:rPr>
+          <w:rFonts w:ascii="Arial" w:hAnsi="Arial" w:cs="Arial"/>
+          <w:iCs/>
+          <w:szCs w:val="24"/>
+          <w:lang w:eastAsia="zh-CN"/>
+        </w:rPr>
+        <w:t>.</w:t>
+      </w:r>
     </w:p>
     <w:p>
       <w:pPr>
+        <w:pStyle w:val="ListParagraph"/>
+        <w:numPr>
+          <w:ilvl w:val="0"/>
+          <w:numId w:val="34"/>
+        </w:numPr>
         <w:tabs>
           <w:tab w:val="left" w:pos="-720"/>
         </w:tabs>
         <w:rPr>
           <w:rFonts w:ascii="Arial" w:hAnsi="Arial" w:cs="Arial"/>
+          <w:b/>
+          <w:szCs w:val="24"/>
+        </w:rPr>
+      </w:pPr>
+      <w:r>
+        <w:rPr>
+          <w:rFonts w:ascii="Arial" w:hAnsi="Arial" w:cs="Arial"/>
+          <w:b/>
           <w:szCs w:val="24"/>
           <w:lang w:val="fr-FR"/>
         </w:rPr>
-      </w:pPr>
+        <w:t>Zhao JH</w:t>
+      </w:r>
+      <w:r>
+        <w:rPr>
+          <w:rFonts w:ascii="Arial" w:hAnsi="Arial" w:cs="Arial"/>
+          <w:szCs w:val="24"/>
+          <w:lang w:val="fr-FR"/>
+        </w:rPr>
+        <w:t xml:space="preserve">, Luan JA. </w:t>
+      </w:r>
+      <w:r>
+        <w:rPr>
+          <w:rFonts w:ascii="Arial" w:hAnsi="Arial" w:cs="Arial"/>
+          <w:szCs w:val="24"/>
+        </w:rPr>
+        <w:t xml:space="preserve">Mixed modeling with whole genome data. </w:t>
+      </w:r>
+      <w:r>
+        <w:rPr>
+          <w:rFonts w:ascii="Arial" w:hAnsi="Arial" w:cs="Arial"/>
+          <w:i/>
+          <w:szCs w:val="24"/>
+        </w:rPr>
+        <w:t>J Prob Stat</w:t>
+      </w:r>
+      <w:r>
+        <w:rPr>
+          <w:rFonts w:ascii="Arial" w:hAnsi="Arial" w:cs="Arial"/>
+          <w:szCs w:val="24"/>
+        </w:rPr>
+        <w:t>. 2012</w:t>
+      </w:r>
+      <w:r>
+        <w:rPr>
+          <w:rFonts w:ascii="Arial" w:hAnsi="Arial" w:cs="Arial"/>
+          <w:i/>
+          <w:szCs w:val="24"/>
+        </w:rPr>
+        <w:t>.</w:t>
+      </w:r>
+      <w:r>
+        <w:rPr>
+          <w:rFonts w:ascii="Arial" w:hAnsi="Arial" w:cs="Arial"/>
+          <w:szCs w:val="24"/>
+        </w:rPr>
+        <w:t xml:space="preserve"> </w:t>
+      </w:r>
+      <w:proofErr w:type="spellStart"/>
+      <w:r>
+        <w:rPr>
+          <w:rFonts w:ascii="Arial" w:hAnsi="Arial" w:cs="Arial"/>
+          <w:szCs w:val="24"/>
+        </w:rPr>
+        <w:t>doi</w:t>
+      </w:r>
+      <w:proofErr w:type="spellEnd"/>
+      <w:r>
+        <w:rPr>
+          <w:rFonts w:ascii="Arial" w:hAnsi="Arial" w:cs="Arial"/>
+          <w:szCs w:val="24"/>
+        </w:rPr>
+        <w:t>:</w:t>
+      </w:r>
+      <w:r>
+        <w:rPr>
+          <w:rFonts w:ascii="Arial" w:hAnsi="Arial" w:cs="Arial"/>
+          <w:szCs w:val="24"/>
+        </w:rPr>
+        <w:t xml:space="preserve"> 10.1155/2012.485174.</w:t>
+      </w:r>
     </w:p>
     <w:p>
       <w:pPr>
+        <w:pStyle w:val="ListParagraph"/>
+        <w:numPr>
+          <w:ilvl w:val="0"/>
+          <w:numId w:val="34"/>
+        </w:numPr>
         <w:tabs>
           <w:tab w:val="left" w:pos="-720"/>
         </w:tabs>
@@ -2085,9 +2287,15 @@
       <w:r>
         <w:rPr>
           <w:rFonts w:ascii="Arial" w:hAnsi="Arial" w:cs="Arial"/>
+          <w:szCs w:val="24"/>
+        </w:rPr>
+        <w:t xml:space="preserve">Xue F, Li S, Luan J, Yuan Z, Luben RN, Khaw K-T, Wareham NJ, Loos RJF, </w:t>
+      </w:r>
+      <w:r>
+        <w:rPr>
+          <w:rFonts w:ascii="Arial" w:hAnsi="Arial" w:cs="Arial"/>
           <w:b/>
           <w:szCs w:val="24"/>
-          <w:lang w:val="fr-FR"/>
         </w:rPr>
         <w:t>Zhao JH</w:t>
       </w:r>
@@ -2095,178 +2303,72 @@
         <w:rPr>
           <w:rFonts w:ascii="Arial" w:hAnsi="Arial" w:cs="Arial"/>
           <w:szCs w:val="24"/>
-          <w:lang w:val="fr-FR"/>
-        </w:rPr>
-        <w:t xml:space="preserve">, Luan JA. </w:t>
-      </w:r>
-      <w:r>
-        <w:rPr>
-          <w:rFonts w:ascii="Arial" w:hAnsi="Arial" w:cs="Arial"/>
-          <w:szCs w:val="24"/>
-        </w:rPr>
-        <w:t xml:space="preserve">Mixed modeling with whole genome data. </w:t>
-      </w:r>
+        </w:rPr>
+        <w:t xml:space="preserve">. A latent variable partial least squares path modeling approach to regional association and polygenic effect with applications to a human obesity study. </w:t>
+      </w:r>
+      <w:proofErr w:type="spellStart"/>
       <w:r>
         <w:rPr>
           <w:rFonts w:ascii="Arial" w:hAnsi="Arial" w:cs="Arial"/>
           <w:i/>
           <w:szCs w:val="24"/>
         </w:rPr>
-        <w:t>J Prob Stat</w:t>
-      </w:r>
-      <w:r>
-        <w:rPr>
-          <w:rFonts w:ascii="Arial" w:hAnsi="Arial" w:cs="Arial"/>
-          <w:szCs w:val="24"/>
-        </w:rPr>
-        <w:t>. 2012</w:t>
-      </w:r>
+        <w:t>PLoS</w:t>
+      </w:r>
+      <w:proofErr w:type="spellEnd"/>
       <w:r>
         <w:rPr>
           <w:rFonts w:ascii="Arial" w:hAnsi="Arial" w:cs="Arial"/>
           <w:i/>
           <w:szCs w:val="24"/>
         </w:rPr>
+        <w:t xml:space="preserve"> ONE</w:t>
+      </w:r>
+      <w:r>
+        <w:rPr>
+          <w:rFonts w:ascii="Arial" w:hAnsi="Arial" w:cs="Arial"/>
+          <w:szCs w:val="24"/>
+        </w:rPr>
+        <w:t xml:space="preserve"> </w:t>
+      </w:r>
+      <w:r>
+        <w:rPr>
+          <w:rFonts w:ascii="Arial" w:hAnsi="Arial" w:cs="Arial"/>
+          <w:szCs w:val="24"/>
+        </w:rPr>
+        <w:t xml:space="preserve">2012, </w:t>
+      </w:r>
+      <w:r>
+        <w:rPr>
+          <w:rFonts w:ascii="Arial" w:hAnsi="Arial" w:cs="Arial"/>
+          <w:b/>
+          <w:bCs/>
+          <w:szCs w:val="24"/>
+        </w:rPr>
+        <w:t>7</w:t>
+      </w:r>
+      <w:r>
+        <w:rPr>
+          <w:rFonts w:ascii="Arial" w:hAnsi="Arial" w:cs="Arial"/>
+          <w:szCs w:val="24"/>
+        </w:rPr>
+        <w:t>(2): e31927</w:t>
+      </w:r>
+      <w:r>
+        <w:rPr>
+          <w:rFonts w:ascii="Arial" w:hAnsi="Arial" w:cs="Arial"/>
+          <w:szCs w:val="24"/>
+        </w:rPr>
         <w:t>.</w:t>
-      </w:r>
-      <w:r>
-        <w:rPr>
-          <w:rFonts w:ascii="Arial" w:hAnsi="Arial" w:cs="Arial"/>
-          <w:szCs w:val="24"/>
-        </w:rPr>
-        <w:t xml:space="preserve"> </w:t>
-      </w:r>
-      <w:proofErr w:type="spellStart"/>
-      <w:r>
-        <w:rPr>
-          <w:rFonts w:ascii="Arial" w:hAnsi="Arial" w:cs="Arial"/>
-          <w:szCs w:val="24"/>
-        </w:rPr>
-        <w:t>doi</w:t>
-      </w:r>
-      <w:proofErr w:type="spellEnd"/>
-      <w:r>
-        <w:rPr>
-          <w:rFonts w:ascii="Arial" w:hAnsi="Arial" w:cs="Arial"/>
-          <w:szCs w:val="24"/>
-        </w:rPr>
-        <w:t>:</w:t>
-      </w:r>
-      <w:r>
-        <w:rPr>
-          <w:rFonts w:ascii="Arial" w:hAnsi="Arial" w:cs="Arial"/>
-          <w:szCs w:val="24"/>
-        </w:rPr>
-        <w:t xml:space="preserve"> 10.1155/2012.485174.</w:t>
       </w:r>
     </w:p>
     <w:p>
       <w:pPr>
-        <w:tabs>
-          <w:tab w:val="left" w:pos="-720"/>
-        </w:tabs>
-        <w:rPr>
-          <w:rFonts w:ascii="Arial" w:hAnsi="Arial" w:cs="Arial"/>
-          <w:b/>
-          <w:szCs w:val="24"/>
-        </w:rPr>
-      </w:pPr>
-    </w:p>
-    <w:p>
-      <w:pPr>
-        <w:tabs>
-          <w:tab w:val="left" w:pos="-720"/>
-        </w:tabs>
-        <w:rPr>
-          <w:rFonts w:ascii="Arial" w:hAnsi="Arial" w:cs="Arial"/>
-          <w:szCs w:val="24"/>
-        </w:rPr>
-      </w:pPr>
-      <w:r>
-        <w:rPr>
-          <w:rFonts w:ascii="Arial" w:hAnsi="Arial" w:cs="Arial"/>
-          <w:szCs w:val="24"/>
-        </w:rPr>
-        <w:t xml:space="preserve">Xue F, Li S, Luan J, Yuan Z, Luben RN, Khaw K-T, Wareham NJ, Loos RJF, </w:t>
-      </w:r>
-      <w:r>
-        <w:rPr>
-          <w:rFonts w:ascii="Arial" w:hAnsi="Arial" w:cs="Arial"/>
-          <w:b/>
-          <w:szCs w:val="24"/>
-        </w:rPr>
-        <w:t>Zhao JH</w:t>
-      </w:r>
-      <w:r>
-        <w:rPr>
-          <w:rFonts w:ascii="Arial" w:hAnsi="Arial" w:cs="Arial"/>
-          <w:szCs w:val="24"/>
-        </w:rPr>
-        <w:t xml:space="preserve">. A latent variable partial least squares path modeling approach to regional association and polygenic effect with applications to a human obesity study. </w:t>
-      </w:r>
-      <w:proofErr w:type="spellStart"/>
-      <w:r>
-        <w:rPr>
-          <w:rFonts w:ascii="Arial" w:hAnsi="Arial" w:cs="Arial"/>
-          <w:i/>
-          <w:szCs w:val="24"/>
-        </w:rPr>
-        <w:t>PLoS</w:t>
-      </w:r>
-      <w:proofErr w:type="spellEnd"/>
-      <w:r>
-        <w:rPr>
-          <w:rFonts w:ascii="Arial" w:hAnsi="Arial" w:cs="Arial"/>
-          <w:i/>
-          <w:szCs w:val="24"/>
-        </w:rPr>
-        <w:t xml:space="preserve"> ONE</w:t>
-      </w:r>
-      <w:r>
-        <w:rPr>
-          <w:rFonts w:ascii="Arial" w:hAnsi="Arial" w:cs="Arial"/>
-          <w:szCs w:val="24"/>
-        </w:rPr>
-        <w:t xml:space="preserve"> </w:t>
-      </w:r>
-      <w:r>
-        <w:rPr>
-          <w:rFonts w:ascii="Arial" w:hAnsi="Arial" w:cs="Arial"/>
-          <w:szCs w:val="24"/>
-        </w:rPr>
-        <w:t xml:space="preserve">2012, </w:t>
-      </w:r>
-      <w:r>
-        <w:rPr>
-          <w:rFonts w:ascii="Arial" w:hAnsi="Arial" w:cs="Arial"/>
-          <w:b/>
-          <w:bCs/>
-          <w:szCs w:val="24"/>
-        </w:rPr>
-        <w:t>7</w:t>
-      </w:r>
-      <w:r>
-        <w:rPr>
-          <w:rFonts w:ascii="Arial" w:hAnsi="Arial" w:cs="Arial"/>
-          <w:szCs w:val="24"/>
-        </w:rPr>
-        <w:t>(2): e31927</w:t>
-      </w:r>
-    </w:p>
-    <w:p>
-      <w:pPr>
-        <w:tabs>
-          <w:tab w:val="left" w:pos="-720"/>
-        </w:tabs>
-        <w:rPr>
-          <w:rFonts w:ascii="Arial" w:hAnsi="Arial" w:cs="Arial"/>
-          <w:b/>
-          <w:szCs w:val="24"/>
-        </w:rPr>
-      </w:pPr>
-    </w:p>
-    <w:p>
-      <w:pPr>
+        <w:pStyle w:val="ListParagraph"/>
+        <w:numPr>
+          <w:ilvl w:val="0"/>
+          <w:numId w:val="34"/>
+        </w:numPr>
         <w:tabs>
           <w:tab w:val="left" w:pos="0"/>
         </w:tabs>
@@ -2281,6 +2383,7 @@
           <w:rFonts w:ascii="Arial" w:hAnsi="Arial" w:cs="Arial"/>
           <w:szCs w:val="24"/>
         </w:rPr>
+        <w:lastRenderedPageBreak/>
         <w:t xml:space="preserve">Loos RJ, </w:t>
       </w:r>
       <w:r>
@@ -2345,18 +2448,21 @@
         </w:rPr>
         <w:t>(6):768-75</w:t>
       </w:r>
+      <w:r>
+        <w:rPr>
+          <w:rFonts w:ascii="Arial" w:hAnsi="Arial" w:cs="Arial"/>
+          <w:szCs w:val="24"/>
+        </w:rPr>
+        <w:t>.</w:t>
+      </w:r>
     </w:p>
     <w:p>
       <w:pPr>
-        <w:autoSpaceDE w:val="0"/>
-        <w:rPr>
-          <w:rFonts w:ascii="Arial" w:hAnsi="Arial" w:cs="Arial"/>
-          <w:szCs w:val="24"/>
-        </w:rPr>
-      </w:pPr>
-    </w:p>
-    <w:p>
-      <w:pPr>
+        <w:pStyle w:val="ListParagraph"/>
+        <w:numPr>
+          <w:ilvl w:val="0"/>
+          <w:numId w:val="34"/>
+        </w:numPr>
         <w:tabs>
           <w:tab w:val="left" w:pos="-720"/>
         </w:tabs>
@@ -2485,14 +2591,6 @@
         </w:rPr>
         <w:t>8</w:t>
       </w:r>
-    </w:p>
-    <w:p>
-      <w:pPr>
-        <w:rPr>
-          <w:rFonts w:ascii="Arial" w:hAnsi="Arial" w:cs="Arial"/>
-          <w:szCs w:val="24"/>
-        </w:rPr>
-      </w:pPr>
     </w:p>
     <w:p>
       <w:pPr>
@@ -3545,7 +3643,6 @@
           <w:szCs w:val="24"/>
           <w:lang w:eastAsia="zh-CN"/>
         </w:rPr>
-        <w:lastRenderedPageBreak/>
         <w:t xml:space="preserve">Shrine N, et al. New genetic signals for lung function highlight pathways and chronic obstructive pulmonary disease associations across multiple ancestries, </w:t>
       </w:r>
       <w:r>
@@ -3682,6 +3779,7 @@
           <w:rFonts w:ascii="Arial" w:hAnsi="Arial" w:cs="Arial"/>
           <w:szCs w:val="24"/>
         </w:rPr>
+        <w:lastRenderedPageBreak/>
         <w:t xml:space="preserve">Sung YJ, et al. A multi-ancestry genome-wide study </w:t>
       </w:r>
       <w:proofErr w:type="spellStart"/>
@@ -5114,7 +5212,6 @@
           <w:szCs w:val="24"/>
           <w:lang w:val="en-GB"/>
         </w:rPr>
-        <w:lastRenderedPageBreak/>
         <w:t xml:space="preserve">Shrine N, et al. </w:t>
       </w:r>
       <w:r>
@@ -5272,6 +5369,7 @@
           <w:b/>
           <w:bCs/>
         </w:rPr>
+        <w:lastRenderedPageBreak/>
         <w:t>Zhao JH</w:t>
       </w:r>
       <w:r>
@@ -7091,7 +7189,7 @@
   <w:abstractNum w:abstractNumId="12" w15:restartNumberingAfterBreak="0">
     <w:nsid w:val="1092648A"/>
     <w:multiLevelType w:val="singleLevel"/>
-    <w:tmpl w:val="222C7D3A"/>
+    <w:tmpl w:val="734832D8"/>
     <w:lvl w:ilvl="0">
       <w:start w:val="188"/>
       <w:numFmt w:val="decimal"/>
@@ -7106,10 +7204,187 @@
       <w:rPr>
         <w:rFonts w:ascii="Arial" w:hAnsi="Arial" w:cs="Arial" w:hint="default"/>
         <w:b w:val="0"/>
+        <w:i w:val="0"/>
+        <w:iCs/>
       </w:rPr>
     </w:lvl>
   </w:abstractNum>
   <w:abstractNum w:abstractNumId="13" w15:restartNumberingAfterBreak="0">
+    <w:nsid w:val="1D78287C"/>
+    <w:multiLevelType w:val="hybridMultilevel"/>
+    <w:tmpl w:val="A1DE2A36"/>
+    <w:lvl w:ilvl="0" w:tplc="08090001">
+      <w:start w:val="1"/>
+      <w:numFmt w:val="bullet"/>
+      <w:lvlText w:val=""/>
+      <w:lvlJc w:val="left"/>
+      <w:pPr>
+        <w:ind w:left="720" w:hanging="360"/>
+      </w:pPr>
+      <w:rPr>
+        <w:rFonts w:ascii="Symbol" w:hAnsi="Symbol" w:hint="default"/>
+      </w:rPr>
+    </w:lvl>
+    <w:lvl w:ilvl="1" w:tplc="FFFFFFFF" w:tentative="1">
+      <w:start w:val="1"/>
+      <w:numFmt w:val="lowerLetter"/>
+      <w:lvlText w:val="%2."/>
+      <w:lvlJc w:val="left"/>
+      <w:pPr>
+        <w:ind w:left="1440" w:hanging="360"/>
+      </w:pPr>
+    </w:lvl>
+    <w:lvl w:ilvl="2" w:tplc="FFFFFFFF" w:tentative="1">
+      <w:start w:val="1"/>
+      <w:numFmt w:val="lowerRoman"/>
+      <w:lvlText w:val="%3."/>
+      <w:lvlJc w:val="right"/>
+      <w:pPr>
+        <w:ind w:left="2160" w:hanging="180"/>
+      </w:pPr>
+    </w:lvl>
+    <w:lvl w:ilvl="3" w:tplc="FFFFFFFF" w:tentative="1">
+      <w:start w:val="1"/>
+      <w:numFmt w:val="decimal"/>
+      <w:lvlText w:val="%4."/>
+      <w:lvlJc w:val="left"/>
+      <w:pPr>
+        <w:ind w:left="2880" w:hanging="360"/>
+      </w:pPr>
+    </w:lvl>
+    <w:lvl w:ilvl="4" w:tplc="FFFFFFFF" w:tentative="1">
+      <w:start w:val="1"/>
+      <w:numFmt w:val="lowerLetter"/>
+      <w:lvlText w:val="%5."/>
+      <w:lvlJc w:val="left"/>
+      <w:pPr>
+        <w:ind w:left="3600" w:hanging="360"/>
+      </w:pPr>
+    </w:lvl>
+    <w:lvl w:ilvl="5" w:tplc="FFFFFFFF" w:tentative="1">
+      <w:start w:val="1"/>
+      <w:numFmt w:val="lowerRoman"/>
+      <w:lvlText w:val="%6."/>
+      <w:lvlJc w:val="right"/>
+      <w:pPr>
+        <w:ind w:left="4320" w:hanging="180"/>
+      </w:pPr>
+    </w:lvl>
+    <w:lvl w:ilvl="6" w:tplc="FFFFFFFF" w:tentative="1">
+      <w:start w:val="1"/>
+      <w:numFmt w:val="decimal"/>
+      <w:lvlText w:val="%7."/>
+      <w:lvlJc w:val="left"/>
+      <w:pPr>
+        <w:ind w:left="5040" w:hanging="360"/>
+      </w:pPr>
+    </w:lvl>
+    <w:lvl w:ilvl="7" w:tplc="FFFFFFFF" w:tentative="1">
+      <w:start w:val="1"/>
+      <w:numFmt w:val="lowerLetter"/>
+      <w:lvlText w:val="%8."/>
+      <w:lvlJc w:val="left"/>
+      <w:pPr>
+        <w:ind w:left="5760" w:hanging="360"/>
+      </w:pPr>
+    </w:lvl>
+    <w:lvl w:ilvl="8" w:tplc="FFFFFFFF" w:tentative="1">
+      <w:start w:val="1"/>
+      <w:numFmt w:val="lowerRoman"/>
+      <w:lvlText w:val="%9."/>
+      <w:lvlJc w:val="right"/>
+      <w:pPr>
+        <w:ind w:left="6480" w:hanging="180"/>
+      </w:pPr>
+    </w:lvl>
+  </w:abstractNum>
+  <w:abstractNum w:abstractNumId="14" w15:restartNumberingAfterBreak="0">
+    <w:nsid w:val="24725C4E"/>
+    <w:multiLevelType w:val="hybridMultilevel"/>
+    <w:tmpl w:val="F0DA6C60"/>
+    <w:lvl w:ilvl="0" w:tplc="0809000F">
+      <w:start w:val="1"/>
+      <w:numFmt w:val="decimal"/>
+      <w:lvlText w:val="%1."/>
+      <w:lvlJc w:val="left"/>
+      <w:pPr>
+        <w:ind w:left="720" w:hanging="360"/>
+      </w:pPr>
+    </w:lvl>
+    <w:lvl w:ilvl="1" w:tplc="08090019" w:tentative="1">
+      <w:start w:val="1"/>
+      <w:numFmt w:val="lowerLetter"/>
+      <w:lvlText w:val="%2."/>
+      <w:lvlJc w:val="left"/>
+      <w:pPr>
+        <w:ind w:left="1440" w:hanging="360"/>
+      </w:pPr>
+    </w:lvl>
+    <w:lvl w:ilvl="2" w:tplc="0809001B" w:tentative="1">
+      <w:start w:val="1"/>
+      <w:numFmt w:val="lowerRoman"/>
+      <w:lvlText w:val="%3."/>
+      <w:lvlJc w:val="right"/>
+      <w:pPr>
+        <w:ind w:left="2160" w:hanging="180"/>
+      </w:pPr>
+    </w:lvl>
+    <w:lvl w:ilvl="3" w:tplc="0809000F" w:tentative="1">
+      <w:start w:val="1"/>
+      <w:numFmt w:val="decimal"/>
+      <w:lvlText w:val="%4."/>
+      <w:lvlJc w:val="left"/>
+      <w:pPr>
+        <w:ind w:left="2880" w:hanging="360"/>
+      </w:pPr>
+    </w:lvl>
+    <w:lvl w:ilvl="4" w:tplc="08090019" w:tentative="1">
+      <w:start w:val="1"/>
+      <w:numFmt w:val="lowerLetter"/>
+      <w:lvlText w:val="%5."/>
+      <w:lvlJc w:val="left"/>
+      <w:pPr>
+        <w:ind w:left="3600" w:hanging="360"/>
+      </w:pPr>
+    </w:lvl>
+    <w:lvl w:ilvl="5" w:tplc="0809001B" w:tentative="1">
+      <w:start w:val="1"/>
+      <w:numFmt w:val="lowerRoman"/>
+      <w:lvlText w:val="%6."/>
+      <w:lvlJc w:val="right"/>
+      <w:pPr>
+        <w:ind w:left="4320" w:hanging="180"/>
+      </w:pPr>
+    </w:lvl>
+    <w:lvl w:ilvl="6" w:tplc="0809000F" w:tentative="1">
+      <w:start w:val="1"/>
+      <w:numFmt w:val="decimal"/>
+      <w:lvlText w:val="%7."/>
+      <w:lvlJc w:val="left"/>
+      <w:pPr>
+        <w:ind w:left="5040" w:hanging="360"/>
+      </w:pPr>
+    </w:lvl>
+    <w:lvl w:ilvl="7" w:tplc="08090019" w:tentative="1">
+      <w:start w:val="1"/>
+      <w:numFmt w:val="lowerLetter"/>
+      <w:lvlText w:val="%8."/>
+      <w:lvlJc w:val="left"/>
+      <w:pPr>
+        <w:ind w:left="5760" w:hanging="360"/>
+      </w:pPr>
+    </w:lvl>
+    <w:lvl w:ilvl="8" w:tplc="0809001B" w:tentative="1">
+      <w:start w:val="1"/>
+      <w:numFmt w:val="lowerRoman"/>
+      <w:lvlText w:val="%9."/>
+      <w:lvlJc w:val="right"/>
+      <w:pPr>
+        <w:ind w:left="6480" w:hanging="180"/>
+      </w:pPr>
+    </w:lvl>
+  </w:abstractNum>
+  <w:abstractNum w:abstractNumId="15" w15:restartNumberingAfterBreak="0">
     <w:nsid w:val="28B43361"/>
     <w:multiLevelType w:val="singleLevel"/>
     <w:tmpl w:val="CBC4AECA"/>
@@ -7130,7 +7405,7 @@
       </w:rPr>
     </w:lvl>
   </w:abstractNum>
-  <w:abstractNum w:abstractNumId="14" w15:restartNumberingAfterBreak="0">
+  <w:abstractNum w:abstractNumId="16" w15:restartNumberingAfterBreak="0">
     <w:nsid w:val="434B6522"/>
     <w:multiLevelType w:val="hybridMultilevel"/>
     <w:tmpl w:val="4BE60926"/>
@@ -7279,7 +7554,7 @@
       </w:rPr>
     </w:lvl>
   </w:abstractNum>
-  <w:abstractNum w:abstractNumId="15" w15:restartNumberingAfterBreak="0">
+  <w:abstractNum w:abstractNumId="17" w15:restartNumberingAfterBreak="0">
     <w:nsid w:val="471F3370"/>
     <w:multiLevelType w:val="hybridMultilevel"/>
     <w:tmpl w:val="776A890E"/>
@@ -7391,7 +7666,7 @@
       </w:rPr>
     </w:lvl>
   </w:abstractNum>
-  <w:abstractNum w:abstractNumId="16" w15:restartNumberingAfterBreak="0">
+  <w:abstractNum w:abstractNumId="18" w15:restartNumberingAfterBreak="0">
     <w:nsid w:val="4E7F2934"/>
     <w:multiLevelType w:val="singleLevel"/>
     <w:tmpl w:val="08090015"/>
@@ -7408,7 +7683,7 @@
       </w:pPr>
     </w:lvl>
   </w:abstractNum>
-  <w:abstractNum w:abstractNumId="17" w15:restartNumberingAfterBreak="0">
+  <w:abstractNum w:abstractNumId="19" w15:restartNumberingAfterBreak="0">
     <w:nsid w:val="600154A7"/>
     <w:multiLevelType w:val="singleLevel"/>
     <w:tmpl w:val="CA7233C6"/>
@@ -7429,7 +7704,7 @@
       </w:rPr>
     </w:lvl>
   </w:abstractNum>
-  <w:abstractNum w:abstractNumId="18" w15:restartNumberingAfterBreak="0">
+  <w:abstractNum w:abstractNumId="20" w15:restartNumberingAfterBreak="0">
     <w:nsid w:val="60F14C3C"/>
     <w:multiLevelType w:val="hybridMultilevel"/>
     <w:tmpl w:val="B5760BCC"/>
@@ -7578,7 +7853,7 @@
       </w:rPr>
     </w:lvl>
   </w:abstractNum>
-  <w:abstractNum w:abstractNumId="19" w15:restartNumberingAfterBreak="0">
+  <w:abstractNum w:abstractNumId="21" w15:restartNumberingAfterBreak="0">
     <w:nsid w:val="6A087773"/>
     <w:multiLevelType w:val="singleLevel"/>
     <w:tmpl w:val="08090001"/>
@@ -7598,7 +7873,7 @@
       </w:rPr>
     </w:lvl>
   </w:abstractNum>
-  <w:abstractNum w:abstractNumId="20" w15:restartNumberingAfterBreak="0">
+  <w:abstractNum w:abstractNumId="22" w15:restartNumberingAfterBreak="0">
     <w:nsid w:val="70E727C8"/>
     <w:multiLevelType w:val="multilevel"/>
     <w:tmpl w:val="EAAC784E"/>
@@ -7761,28 +8036,28 @@
     <w:abstractNumId w:val="11"/>
   </w:num>
   <w:num w:numId="23" w16cid:durableId="698703181">
-    <w:abstractNumId w:val="13"/>
+    <w:abstractNumId w:val="15"/>
   </w:num>
   <w:num w:numId="24" w16cid:durableId="204953071">
-    <w:abstractNumId w:val="17"/>
+    <w:abstractNumId w:val="19"/>
   </w:num>
   <w:num w:numId="25" w16cid:durableId="1878352501">
-    <w:abstractNumId w:val="20"/>
+    <w:abstractNumId w:val="22"/>
   </w:num>
   <w:num w:numId="26" w16cid:durableId="1956984304">
-    <w:abstractNumId w:val="16"/>
+    <w:abstractNumId w:val="18"/>
   </w:num>
   <w:num w:numId="27" w16cid:durableId="1820463236">
-    <w:abstractNumId w:val="19"/>
+    <w:abstractNumId w:val="21"/>
   </w:num>
   <w:num w:numId="28" w16cid:durableId="1080255720">
     <w:abstractNumId w:val="12"/>
   </w:num>
   <w:num w:numId="29" w16cid:durableId="1838224622">
-    <w:abstractNumId w:val="18"/>
+    <w:abstractNumId w:val="20"/>
   </w:num>
   <w:num w:numId="30" w16cid:durableId="806893473">
-    <w:abstractNumId w:val="14"/>
+    <w:abstractNumId w:val="16"/>
   </w:num>
   <w:num w:numId="31" w16cid:durableId="1599410753">
     <w:abstractNumId w:val="10"/>
@@ -7815,7 +8090,13 @@
     </w:lvlOverride>
   </w:num>
   <w:num w:numId="32" w16cid:durableId="1851331852">
-    <w:abstractNumId w:val="15"/>
+    <w:abstractNumId w:val="17"/>
+  </w:num>
+  <w:num w:numId="33" w16cid:durableId="1311786396">
+    <w:abstractNumId w:val="14"/>
+  </w:num>
+  <w:num w:numId="34" w16cid:durableId="1518694542">
+    <w:abstractNumId w:val="13"/>
   </w:num>
 </w:numbering>
 </file>

</xml_diff>